<commit_message>
Update IDD and RDD
</commit_message>
<xml_diff>
--- a/document/RDD.docx
+++ b/document/RDD.docx
@@ -115,6 +115,7 @@
         <w:rPr>
           <w:rFonts w:asciiTheme="majorEastAsia" w:eastAsiaTheme="majorEastAsia" w:hAnsiTheme="majorEastAsia"/>
           <w:b/>
+          <w:noProof/>
           <w:sz w:val="40"/>
           <w:szCs w:val="40"/>
         </w:rPr>
@@ -4929,7 +4930,19 @@
         <w:rPr>
           <w:rFonts w:hint="eastAsia"/>
         </w:rPr>
-        <w:t>의 데이터 처리 처리량(</w:t>
+        <w:t>의 데이터</w:t>
+      </w:r>
+      <w:r>
+        <w:rPr>
+          <w:rFonts w:hint="eastAsia"/>
+        </w:rPr>
+        <w:t xml:space="preserve"> </w:t>
+      </w:r>
+      <w:r>
+        <w:rPr>
+          <w:rFonts w:hint="eastAsia"/>
+        </w:rPr>
+        <w:t>처리량(</w:t>
       </w:r>
       <w:r>
         <w:t>Throughput)</w:t>
@@ -4958,8 +4971,21 @@
         </w:rPr>
         <w:t>단계(</w:t>
       </w:r>
-      <w:r>
-        <w:t>IF1, IF2, EX, MEM, WB)</w:t>
+      <w:proofErr w:type="spellStart"/>
+      <w:r>
+        <w:t>IF1</w:t>
+      </w:r>
+      <w:proofErr w:type="spellEnd"/>
+      <w:r>
+        <w:t xml:space="preserve">, </w:t>
+      </w:r>
+      <w:proofErr w:type="spellStart"/>
+      <w:r>
+        <w:t>IF2</w:t>
+      </w:r>
+      <w:proofErr w:type="spellEnd"/>
+      <w:r>
+        <w:t>, EX, MEM, WB)</w:t>
       </w:r>
       <w:r>
         <w:rPr>
@@ -5057,21 +5083,31 @@
         <w:spacing w:after="0"/>
         <w:ind w:leftChars="0"/>
       </w:pPr>
+      <w:proofErr w:type="spellStart"/>
       <w:r>
         <w:rPr>
           <w:rFonts w:hint="eastAsia"/>
         </w:rPr>
-        <w:t>변수명,</w:t>
+        <w:t>변수명</w:t>
+      </w:r>
+      <w:proofErr w:type="spellEnd"/>
+      <w:r>
+        <w:rPr>
+          <w:rFonts w:hint="eastAsia"/>
+        </w:rPr>
+        <w:t>,</w:t>
       </w:r>
       <w:r>
         <w:t xml:space="preserve"> </w:t>
       </w:r>
+      <w:proofErr w:type="spellStart"/>
       <w:r>
         <w:rPr>
           <w:rFonts w:hint="eastAsia"/>
         </w:rPr>
         <w:t>모듈명</w:t>
       </w:r>
+      <w:proofErr w:type="spellEnd"/>
       <w:r>
         <w:t xml:space="preserve">, </w:t>
       </w:r>
@@ -5081,8 +5117,13 @@
         </w:rPr>
         <w:t xml:space="preserve">파일명 등 모든 표기 스타일은 </w:t>
       </w:r>
-      <w:r>
-        <w:t xml:space="preserve">snake_case </w:t>
+      <w:proofErr w:type="spellStart"/>
+      <w:r>
+        <w:t>snake_case</w:t>
+      </w:r>
+      <w:proofErr w:type="spellEnd"/>
+      <w:r>
+        <w:t xml:space="preserve"> </w:t>
       </w:r>
       <w:r>
         <w:rPr>
@@ -5100,11 +5141,25 @@
         <w:t>예시)</w:t>
       </w:r>
       <w:r>
-        <w:t xml:space="preserve"> abc_def, h_ijk_lm_nop</w:t>
-      </w:r>
+        <w:t xml:space="preserve"> </w:t>
+      </w:r>
+      <w:proofErr w:type="spellStart"/>
+      <w:r>
+        <w:t>abc_def</w:t>
+      </w:r>
+      <w:proofErr w:type="spellEnd"/>
       <w:r>
         <w:t xml:space="preserve">, </w:t>
       </w:r>
+      <w:proofErr w:type="spellStart"/>
+      <w:r>
+        <w:t>h_ijk_lm_nop</w:t>
+      </w:r>
+      <w:proofErr w:type="spellEnd"/>
+      <w:r>
+        <w:t xml:space="preserve">, </w:t>
+      </w:r>
+      <w:proofErr w:type="spellStart"/>
       <w:r>
         <w:rPr>
           <w:rFonts w:hint="eastAsia"/>
@@ -5112,8 +5167,17 @@
         <w:t>q</w:t>
       </w:r>
       <w:r>
-        <w:t>_r_s_tuv, wxyz</w:t>
-      </w:r>
+        <w:t>_r_s_tuv</w:t>
+      </w:r>
+      <w:proofErr w:type="spellEnd"/>
+      <w:r>
+        <w:t xml:space="preserve">, </w:t>
+      </w:r>
+      <w:proofErr w:type="spellStart"/>
+      <w:r>
+        <w:t>wxyz</w:t>
+      </w:r>
+      <w:proofErr w:type="spellEnd"/>
     </w:p>
     <w:p>
       <w:pPr>
@@ -5203,8 +5267,21 @@
         </w:rPr>
         <w:t>(</w:t>
       </w:r>
-      <w:r>
-        <w:t xml:space="preserve">clk, rst), </w:t>
+      <w:proofErr w:type="spellStart"/>
+      <w:r>
+        <w:t>clk</w:t>
+      </w:r>
+      <w:proofErr w:type="spellEnd"/>
+      <w:r>
+        <w:t xml:space="preserve">, </w:t>
+      </w:r>
+      <w:proofErr w:type="spellStart"/>
+      <w:r>
+        <w:t>rst</w:t>
+      </w:r>
+      <w:proofErr w:type="spellEnd"/>
+      <w:r>
+        <w:t xml:space="preserve">), </w:t>
       </w:r>
       <w:r>
         <w:rPr>
@@ -5212,8 +5289,13 @@
         </w:rPr>
         <w:t>모듈 내부 저장소(</w:t>
       </w:r>
-      <w:r>
-        <w:t xml:space="preserve">fifo, buffer, memory </w:t>
+      <w:proofErr w:type="spellStart"/>
+      <w:r>
+        <w:t>fifo</w:t>
+      </w:r>
+      <w:proofErr w:type="spellEnd"/>
+      <w:r>
+        <w:t xml:space="preserve">, buffer, memory </w:t>
       </w:r>
       <w:r>
         <w:rPr>
@@ -5458,12 +5540,14 @@
             <w:pPr>
               <w:jc w:val="left"/>
             </w:pPr>
+            <w:proofErr w:type="spellStart"/>
             <w:r>
               <w:rPr>
                 <w:rFonts w:hint="eastAsia"/>
               </w:rPr>
               <w:t>i</w:t>
             </w:r>
+            <w:proofErr w:type="spellEnd"/>
             <w:r>
               <w:t>_</w:t>
             </w:r>
@@ -5554,6 +5638,7 @@
             <w:pPr>
               <w:jc w:val="left"/>
             </w:pPr>
+            <w:proofErr w:type="spellStart"/>
             <w:r>
               <w:rPr>
                 <w:rFonts w:hint="eastAsia"/>
@@ -5563,6 +5648,7 @@
             <w:r>
               <w:t>nout</w:t>
             </w:r>
+            <w:proofErr w:type="spellEnd"/>
           </w:p>
         </w:tc>
         <w:tc>
@@ -6011,6 +6097,7 @@
                 <w:b/>
               </w:rPr>
             </w:pPr>
+            <w:proofErr w:type="spellStart"/>
             <w:r>
               <w:rPr>
                 <w:rFonts w:hint="eastAsia"/>
@@ -6018,6 +6105,7 @@
               </w:rPr>
               <w:t>모듈명</w:t>
             </w:r>
+            <w:proofErr w:type="spellEnd"/>
           </w:p>
         </w:tc>
         <w:tc>
@@ -6095,12 +6183,14 @@
             <w:r>
               <w:fldChar w:fldCharType="separate"/>
             </w:r>
+            <w:proofErr w:type="spellStart"/>
             <w:r>
               <w:rPr>
                 <w:rFonts w:hint="eastAsia"/>
               </w:rPr>
               <w:t>누산기</w:t>
             </w:r>
+            <w:proofErr w:type="spellEnd"/>
             <w:r>
               <w:t>(Adder)</w:t>
             </w:r>
@@ -6121,9 +6211,11 @@
             <w:pPr>
               <w:jc w:val="center"/>
             </w:pPr>
+            <w:proofErr w:type="spellStart"/>
             <w:r>
               <w:t>adder21</w:t>
             </w:r>
+            <w:proofErr w:type="spellEnd"/>
           </w:p>
         </w:tc>
         <w:tc>
@@ -6138,6 +6230,7 @@
             <w:pPr>
               <w:jc w:val="center"/>
             </w:pPr>
+            <w:proofErr w:type="spellStart"/>
             <w:r>
               <w:rPr>
                 <w:rFonts w:hint="eastAsia"/>
@@ -6147,6 +6240,7 @@
             <w:r>
               <w:t>dder.sv</w:t>
             </w:r>
+            <w:proofErr w:type="spellEnd"/>
           </w:p>
         </w:tc>
         <w:tc>
@@ -6244,6 +6338,7 @@
             <w:pPr>
               <w:jc w:val="center"/>
             </w:pPr>
+            <w:proofErr w:type="spellStart"/>
             <w:r>
               <w:rPr>
                 <w:rFonts w:hint="eastAsia"/>
@@ -6253,6 +6348,7 @@
             <w:r>
               <w:t>lu.sv</w:t>
             </w:r>
+            <w:proofErr w:type="spellEnd"/>
           </w:p>
         </w:tc>
         <w:tc>
@@ -6333,9 +6429,11 @@
             <w:pPr>
               <w:jc w:val="center"/>
             </w:pPr>
+            <w:proofErr w:type="spellStart"/>
             <w:r>
               <w:t>alu_ctr</w:t>
             </w:r>
+            <w:proofErr w:type="spellEnd"/>
           </w:p>
         </w:tc>
         <w:tc>
@@ -6347,6 +6445,7 @@
             <w:pPr>
               <w:jc w:val="center"/>
             </w:pPr>
+            <w:proofErr w:type="spellStart"/>
             <w:r>
               <w:rPr>
                 <w:rFonts w:hint="eastAsia"/>
@@ -6356,6 +6455,7 @@
             <w:r>
               <w:t>lu_ctr.sv</w:t>
             </w:r>
+            <w:proofErr w:type="spellEnd"/>
           </w:p>
         </w:tc>
         <w:tc>
@@ -6428,6 +6528,7 @@
             <w:pPr>
               <w:jc w:val="center"/>
             </w:pPr>
+            <w:proofErr w:type="spellStart"/>
             <w:r>
               <w:rPr>
                 <w:rFonts w:hint="eastAsia"/>
@@ -6437,6 +6538,7 @@
             <w:r>
               <w:t>f_id</w:t>
             </w:r>
+            <w:proofErr w:type="spellEnd"/>
           </w:p>
         </w:tc>
         <w:tc>
@@ -6449,9 +6551,11 @@
             <w:pPr>
               <w:jc w:val="center"/>
             </w:pPr>
+            <w:proofErr w:type="spellStart"/>
             <w:r>
               <w:t>bridge.sv</w:t>
             </w:r>
+            <w:proofErr w:type="spellEnd"/>
           </w:p>
         </w:tc>
         <w:tc>
@@ -6504,6 +6608,7 @@
             <w:pPr>
               <w:jc w:val="center"/>
             </w:pPr>
+            <w:proofErr w:type="spellStart"/>
             <w:r>
               <w:rPr>
                 <w:rFonts w:hint="eastAsia"/>
@@ -6513,6 +6618,7 @@
             <w:r>
               <w:t>d_ex</w:t>
             </w:r>
+            <w:proofErr w:type="spellEnd"/>
           </w:p>
         </w:tc>
         <w:tc>
@@ -6562,6 +6668,7 @@
             <w:pPr>
               <w:jc w:val="center"/>
             </w:pPr>
+            <w:proofErr w:type="spellStart"/>
             <w:r>
               <w:rPr>
                 <w:rFonts w:hint="eastAsia"/>
@@ -6571,6 +6678,7 @@
             <w:r>
               <w:t>x_mem</w:t>
             </w:r>
+            <w:proofErr w:type="spellEnd"/>
           </w:p>
         </w:tc>
         <w:tc>
@@ -6620,6 +6728,7 @@
             <w:pPr>
               <w:jc w:val="center"/>
             </w:pPr>
+            <w:proofErr w:type="spellStart"/>
             <w:r>
               <w:rPr>
                 <w:rFonts w:hint="eastAsia"/>
@@ -6629,6 +6738,7 @@
             <w:r>
               <w:t>em_wb</w:t>
             </w:r>
+            <w:proofErr w:type="spellEnd"/>
           </w:p>
         </w:tc>
         <w:tc>
@@ -6701,9 +6811,11 @@
             <w:pPr>
               <w:jc w:val="center"/>
             </w:pPr>
+            <w:proofErr w:type="spellStart"/>
             <w:r>
               <w:t>ctr_unit</w:t>
             </w:r>
+            <w:proofErr w:type="spellEnd"/>
           </w:p>
         </w:tc>
         <w:tc>
@@ -6715,6 +6827,7 @@
             <w:pPr>
               <w:jc w:val="center"/>
             </w:pPr>
+            <w:proofErr w:type="spellStart"/>
             <w:r>
               <w:rPr>
                 <w:rFonts w:hint="eastAsia"/>
@@ -6724,6 +6837,7 @@
             <w:r>
               <w:t>tr_unit.sv</w:t>
             </w:r>
+            <w:proofErr w:type="spellEnd"/>
           </w:p>
         </w:tc>
         <w:tc>
@@ -6796,9 +6910,11 @@
             <w:pPr>
               <w:jc w:val="center"/>
             </w:pPr>
+            <w:proofErr w:type="spellStart"/>
             <w:r>
               <w:t>alu_forwarding_unit</w:t>
             </w:r>
+            <w:proofErr w:type="spellEnd"/>
           </w:p>
         </w:tc>
         <w:tc>
@@ -6811,9 +6927,11 @@
             <w:pPr>
               <w:jc w:val="center"/>
             </w:pPr>
+            <w:proofErr w:type="spellStart"/>
             <w:r>
               <w:t>forwarding_unit.sv</w:t>
             </w:r>
+            <w:proofErr w:type="spellEnd"/>
           </w:p>
         </w:tc>
         <w:tc>
@@ -6866,6 +6984,7 @@
             <w:pPr>
               <w:jc w:val="center"/>
             </w:pPr>
+            <w:proofErr w:type="spellStart"/>
             <w:r>
               <w:rPr>
                 <w:rFonts w:hint="eastAsia"/>
@@ -6875,6 +6994,7 @@
             <w:r>
               <w:t>data_forwarding_unit</w:t>
             </w:r>
+            <w:proofErr w:type="spellEnd"/>
           </w:p>
         </w:tc>
         <w:tc>
@@ -6924,6 +7044,7 @@
             <w:pPr>
               <w:jc w:val="center"/>
             </w:pPr>
+            <w:proofErr w:type="spellStart"/>
             <w:r>
               <w:rPr>
                 <w:rFonts w:hint="eastAsia"/>
@@ -6933,6 +7054,7 @@
             <w:r>
               <w:t>oad_stall_unit</w:t>
             </w:r>
+            <w:proofErr w:type="spellEnd"/>
           </w:p>
         </w:tc>
         <w:tc>
@@ -6983,8 +7105,16 @@
               <w:rPr>
                 <w:rFonts w:hint="eastAsia"/>
               </w:rPr>
-              <w:t>명령어 복호기</w:t>
-            </w:r>
+              <w:t xml:space="preserve">명령어 </w:t>
+            </w:r>
+            <w:proofErr w:type="spellStart"/>
+            <w:r>
+              <w:rPr>
+                <w:rFonts w:hint="eastAsia"/>
+              </w:rPr>
+              <w:t>복호기</w:t>
+            </w:r>
+            <w:proofErr w:type="spellEnd"/>
             <w:r>
               <w:t>(Instruction Decoder)</w:t>
             </w:r>
@@ -7002,9 +7132,11 @@
             <w:pPr>
               <w:jc w:val="center"/>
             </w:pPr>
+            <w:proofErr w:type="spellStart"/>
             <w:r>
               <w:t>inst_decoder</w:t>
             </w:r>
+            <w:proofErr w:type="spellEnd"/>
           </w:p>
         </w:tc>
         <w:tc>
@@ -7016,6 +7148,7 @@
             <w:pPr>
               <w:jc w:val="center"/>
             </w:pPr>
+            <w:proofErr w:type="spellStart"/>
             <w:r>
               <w:rPr>
                 <w:rFonts w:hint="eastAsia"/>
@@ -7025,6 +7158,7 @@
             <w:r>
               <w:t>nst_decoder.sv</w:t>
             </w:r>
+            <w:proofErr w:type="spellEnd"/>
           </w:p>
         </w:tc>
         <w:tc>
@@ -7073,11 +7207,19 @@
             <w:r>
               <w:fldChar w:fldCharType="separate"/>
             </w:r>
-            <w:r>
-              <w:rPr>
-                <w:rFonts w:hint="eastAsia"/>
-              </w:rPr>
-              <w:t>승제산 장치(</w:t>
+            <w:proofErr w:type="spellStart"/>
+            <w:r>
+              <w:rPr>
+                <w:rFonts w:hint="eastAsia"/>
+              </w:rPr>
+              <w:t>승제산</w:t>
+            </w:r>
+            <w:proofErr w:type="spellEnd"/>
+            <w:r>
+              <w:rPr>
+                <w:rFonts w:hint="eastAsia"/>
+              </w:rPr>
+              <w:t xml:space="preserve"> 장치(</w:t>
             </w:r>
             <w:r>
               <w:t>Mul/Div Unit)</w:t>
@@ -7096,6 +7238,7 @@
             <w:pPr>
               <w:jc w:val="center"/>
             </w:pPr>
+            <w:proofErr w:type="spellStart"/>
             <w:r>
               <w:rPr>
                 <w:rFonts w:hint="eastAsia"/>
@@ -7105,6 +7248,7 @@
             <w:r>
               <w:t>ul_div_unit</w:t>
             </w:r>
+            <w:proofErr w:type="spellEnd"/>
           </w:p>
         </w:tc>
         <w:tc>
@@ -7116,6 +7260,7 @@
             <w:pPr>
               <w:jc w:val="center"/>
             </w:pPr>
+            <w:proofErr w:type="spellStart"/>
             <w:r>
               <w:rPr>
                 <w:rFonts w:hint="eastAsia"/>
@@ -7125,6 +7270,7 @@
             <w:r>
               <w:t>ul_div_unit.sv</w:t>
             </w:r>
+            <w:proofErr w:type="spellEnd"/>
           </w:p>
         </w:tc>
         <w:tc>
@@ -7174,12 +7320,14 @@
             <w:r>
               <w:fldChar w:fldCharType="separate"/>
             </w:r>
+            <w:proofErr w:type="spellStart"/>
             <w:r>
               <w:rPr>
                 <w:rFonts w:hint="eastAsia"/>
               </w:rPr>
               <w:t>멀티플렉서</w:t>
             </w:r>
+            <w:proofErr w:type="spellEnd"/>
             <w:r>
               <w:t>(Multiplexer)</w:t>
             </w:r>
@@ -7197,9 +7345,11 @@
             <w:pPr>
               <w:jc w:val="center"/>
             </w:pPr>
+            <w:proofErr w:type="spellStart"/>
             <w:r>
               <w:t>mux21</w:t>
             </w:r>
+            <w:proofErr w:type="spellEnd"/>
           </w:p>
         </w:tc>
         <w:tc>
@@ -7212,6 +7362,7 @@
             <w:pPr>
               <w:jc w:val="center"/>
             </w:pPr>
+            <w:proofErr w:type="spellStart"/>
             <w:r>
               <w:rPr>
                 <w:rFonts w:hint="eastAsia"/>
@@ -7221,6 +7372,7 @@
             <w:r>
               <w:t>ux.sv</w:t>
             </w:r>
+            <w:proofErr w:type="spellEnd"/>
           </w:p>
         </w:tc>
         <w:tc>
@@ -7273,6 +7425,7 @@
             <w:pPr>
               <w:jc w:val="center"/>
             </w:pPr>
+            <w:proofErr w:type="spellStart"/>
             <w:r>
               <w:rPr>
                 <w:rFonts w:hint="eastAsia"/>
@@ -7282,6 +7435,7 @@
             <w:r>
               <w:t>ux41</w:t>
             </w:r>
+            <w:proofErr w:type="spellEnd"/>
           </w:p>
         </w:tc>
         <w:tc>
@@ -7365,6 +7519,7 @@
             <w:pPr>
               <w:jc w:val="center"/>
             </w:pPr>
+            <w:proofErr w:type="spellStart"/>
             <w:r>
               <w:rPr>
                 <w:rFonts w:hint="eastAsia"/>
@@ -7374,6 +7529,7 @@
             <w:r>
               <w:t>c.sv</w:t>
             </w:r>
+            <w:proofErr w:type="spellEnd"/>
           </w:p>
         </w:tc>
         <w:tc>
@@ -7459,6 +7615,7 @@
             <w:pPr>
               <w:jc w:val="center"/>
             </w:pPr>
+            <w:proofErr w:type="spellStart"/>
             <w:r>
               <w:rPr>
                 <w:rFonts w:hint="eastAsia"/>
@@ -7468,6 +7625,7 @@
             <w:r>
               <w:t>egisters.sv</w:t>
             </w:r>
+            <w:proofErr w:type="spellEnd"/>
           </w:p>
         </w:tc>
         <w:tc>
@@ -7520,7 +7678,21 @@
               <w:rPr>
                 <w:rFonts w:hint="eastAsia"/>
               </w:rPr>
-              <w:t>좌측 쉬프트 이동기</w:t>
+              <w:t xml:space="preserve">좌측 </w:t>
+            </w:r>
+            <w:proofErr w:type="spellStart"/>
+            <w:r>
+              <w:rPr>
+                <w:rFonts w:hint="eastAsia"/>
+              </w:rPr>
+              <w:t>쉬프트</w:t>
+            </w:r>
+            <w:proofErr w:type="spellEnd"/>
+            <w:r>
+              <w:rPr>
+                <w:rFonts w:hint="eastAsia"/>
+              </w:rPr>
+              <w:t xml:space="preserve"> 이동기</w:t>
             </w:r>
             <w:r>
               <w:t>(Shift Left Unit)</w:t>
@@ -7539,9 +7711,11 @@
             <w:pPr>
               <w:jc w:val="center"/>
             </w:pPr>
+            <w:proofErr w:type="spellStart"/>
             <w:r>
               <w:t>shift_left</w:t>
             </w:r>
+            <w:proofErr w:type="spellEnd"/>
           </w:p>
         </w:tc>
         <w:tc>
@@ -7553,6 +7727,7 @@
             <w:pPr>
               <w:jc w:val="center"/>
             </w:pPr>
+            <w:proofErr w:type="spellStart"/>
             <w:r>
               <w:rPr>
                 <w:rFonts w:hint="eastAsia"/>
@@ -7562,6 +7737,7 @@
             <w:r>
               <w:t>hift_left.sv</w:t>
             </w:r>
+            <w:proofErr w:type="spellEnd"/>
           </w:p>
         </w:tc>
         <w:tc>
@@ -7614,7 +7790,21 @@
               <w:rPr>
                 <w:rFonts w:hint="eastAsia"/>
               </w:rPr>
-              <w:t>부호 확장기(</w:t>
+              <w:t xml:space="preserve">부호 </w:t>
+            </w:r>
+            <w:proofErr w:type="spellStart"/>
+            <w:r>
+              <w:rPr>
+                <w:rFonts w:hint="eastAsia"/>
+              </w:rPr>
+              <w:t>확장기</w:t>
+            </w:r>
+            <w:proofErr w:type="spellEnd"/>
+            <w:r>
+              <w:rPr>
+                <w:rFonts w:hint="eastAsia"/>
+              </w:rPr>
+              <w:t>(</w:t>
             </w:r>
             <w:r>
               <w:t>Sign Extend Unit)</w:t>
@@ -7633,9 +7823,11 @@
             <w:pPr>
               <w:jc w:val="center"/>
             </w:pPr>
+            <w:proofErr w:type="spellStart"/>
             <w:r>
               <w:t>sign_extend</w:t>
             </w:r>
+            <w:proofErr w:type="spellEnd"/>
           </w:p>
         </w:tc>
         <w:tc>
@@ -7647,6 +7839,7 @@
             <w:pPr>
               <w:jc w:val="center"/>
             </w:pPr>
+            <w:proofErr w:type="spellStart"/>
             <w:r>
               <w:rPr>
                 <w:rFonts w:hint="eastAsia"/>
@@ -7656,6 +7849,7 @@
             <w:r>
               <w:t>ign_extend.sv</w:t>
             </w:r>
+            <w:proofErr w:type="spellEnd"/>
           </w:p>
         </w:tc>
         <w:tc>
@@ -7727,9 +7921,11 @@
             <w:pPr>
               <w:jc w:val="center"/>
             </w:pPr>
+            <w:proofErr w:type="spellStart"/>
             <w:r>
               <w:t>top_cpu</w:t>
             </w:r>
+            <w:proofErr w:type="spellEnd"/>
           </w:p>
         </w:tc>
         <w:tc>
@@ -7741,6 +7937,7 @@
             <w:pPr>
               <w:jc w:val="center"/>
             </w:pPr>
+            <w:proofErr w:type="spellStart"/>
             <w:r>
               <w:rPr>
                 <w:rFonts w:hint="eastAsia"/>
@@ -7750,6 +7947,7 @@
             <w:r>
               <w:t>op_cpu.sv</w:t>
             </w:r>
+            <w:proofErr w:type="spellEnd"/>
           </w:p>
         </w:tc>
         <w:tc>
@@ -8005,6 +8203,7 @@
                 <w:b/>
               </w:rPr>
             </w:pPr>
+            <w:proofErr w:type="spellStart"/>
             <w:r>
               <w:rPr>
                 <w:rFonts w:hint="eastAsia"/>
@@ -8018,6 +8217,7 @@
               </w:rPr>
               <w:t>DDR_BIT</w:t>
             </w:r>
+            <w:proofErr w:type="spellEnd"/>
           </w:p>
         </w:tc>
         <w:tc>
@@ -8039,7 +8239,7 @@
               <w:rPr>
                 <w:rFonts w:hint="eastAsia"/>
               </w:rPr>
-              <w:t>1</w:t>
+              <w:t>3</w:t>
             </w:r>
             <w:r>
               <w:t>2</w:t>
@@ -8114,6 +8314,7 @@
                 <w:b/>
               </w:rPr>
             </w:pPr>
+            <w:proofErr w:type="spellStart"/>
             <w:r>
               <w:rPr>
                 <w:rFonts w:hint="eastAsia"/>
@@ -8127,6 +8328,7 @@
               </w:rPr>
               <w:t>ATA_BIT</w:t>
             </w:r>
+            <w:proofErr w:type="spellEnd"/>
           </w:p>
         </w:tc>
         <w:tc>
@@ -8334,6 +8536,7 @@
                 <w:b/>
               </w:rPr>
             </w:pPr>
+            <w:proofErr w:type="spellStart"/>
             <w:r>
               <w:rPr>
                 <w:rFonts w:hint="eastAsia"/>
@@ -8347,6 +8550,7 @@
               </w:rPr>
               <w:t>PCODE_BIT</w:t>
             </w:r>
+            <w:proofErr w:type="spellEnd"/>
           </w:p>
         </w:tc>
         <w:tc>
@@ -8584,6 +8788,7 @@
                 <w:b/>
               </w:rPr>
             </w:pPr>
+            <w:proofErr w:type="spellStart"/>
             <w:r>
               <w:rPr>
                 <w:rFonts w:hint="eastAsia"/>
@@ -8597,6 +8802,7 @@
               </w:rPr>
               <w:t>EG_BIT</w:t>
             </w:r>
+            <w:proofErr w:type="spellEnd"/>
           </w:p>
         </w:tc>
         <w:tc>
@@ -8791,12 +8997,14 @@
       <w:bookmarkStart w:id="24" w:name="_Ref229928214"/>
       <w:bookmarkStart w:id="25" w:name="_Toc230456443"/>
       <w:bookmarkStart w:id="26" w:name="_Toc230458227"/>
+      <w:proofErr w:type="spellStart"/>
       <w:r>
         <w:rPr>
           <w:rFonts w:hint="eastAsia"/>
         </w:rPr>
         <w:t>누산기</w:t>
       </w:r>
+      <w:proofErr w:type="spellEnd"/>
       <w:r>
         <w:t>(Adder)</w:t>
       </w:r>
@@ -8810,11 +9018,19 @@
       </w:pPr>
       <w:bookmarkStart w:id="27" w:name="_Toc230456444"/>
       <w:bookmarkStart w:id="28" w:name="_Toc230458228"/>
+      <w:proofErr w:type="spellStart"/>
       <w:r>
         <w:rPr>
           <w:rFonts w:hint="eastAsia"/>
         </w:rPr>
-        <w:t>누산기 기능</w:t>
+        <w:t>누산기</w:t>
+      </w:r>
+      <w:proofErr w:type="spellEnd"/>
+      <w:r>
+        <w:rPr>
+          <w:rFonts w:hint="eastAsia"/>
+        </w:rPr>
+        <w:t xml:space="preserve"> 기능</w:t>
       </w:r>
       <w:bookmarkEnd w:id="27"/>
       <w:bookmarkEnd w:id="28"/>
@@ -8825,6 +9041,9 @@
         <w:jc w:val="center"/>
       </w:pPr>
       <w:r>
+        <w:rPr>
+          <w:noProof/>
+        </w:rPr>
         <w:drawing>
           <wp:inline distT="0" distB="0" distL="0" distR="0" wp14:anchorId="5D311A93" wp14:editId="1E90812B">
             <wp:extent cx="2943636" cy="2067213"/>
@@ -8891,6 +9110,7 @@
       <w:r>
         <w:t xml:space="preserve"> </w:t>
       </w:r>
+      <w:proofErr w:type="spellStart"/>
       <w:r>
         <w:rPr>
           <w:rFonts w:hint="eastAsia"/>
@@ -8900,6 +9120,7 @@
       <w:r>
         <w:t>dder21</w:t>
       </w:r>
+      <w:proofErr w:type="spellEnd"/>
       <w:r>
         <w:rPr>
           <w:rFonts w:hint="eastAsia"/>
@@ -8930,11 +9151,19 @@
       <w:r>
         <w:t xml:space="preserve"> </w:t>
       </w:r>
+      <w:proofErr w:type="spellStart"/>
       <w:r>
         <w:rPr>
           <w:rFonts w:hint="eastAsia"/>
         </w:rPr>
-        <w:t xml:space="preserve">누산기는 </w:t>
+        <w:t>누산기는</w:t>
+      </w:r>
+      <w:proofErr w:type="spellEnd"/>
+      <w:r>
+        <w:rPr>
+          <w:rFonts w:hint="eastAsia"/>
+        </w:rPr>
+        <w:t xml:space="preserve"> </w:t>
       </w:r>
       <w:r>
         <w:rPr>
@@ -9084,6 +9313,7 @@
                 <w:b/>
               </w:rPr>
             </w:pPr>
+            <w:proofErr w:type="spellStart"/>
             <w:r>
               <w:rPr>
                 <w:rFonts w:hint="eastAsia"/>
@@ -9091,6 +9321,7 @@
               </w:rPr>
               <w:t>모듈명</w:t>
             </w:r>
+            <w:proofErr w:type="spellEnd"/>
           </w:p>
         </w:tc>
         <w:tc>
@@ -9105,9 +9336,11 @@
             <w:pPr>
               <w:jc w:val="center"/>
             </w:pPr>
+            <w:proofErr w:type="spellStart"/>
             <w:r>
               <w:t>adder21</w:t>
             </w:r>
+            <w:proofErr w:type="spellEnd"/>
           </w:p>
         </w:tc>
         <w:tc>
@@ -9180,9 +9413,11 @@
             <w:pPr>
               <w:jc w:val="center"/>
             </w:pPr>
+            <w:proofErr w:type="spellStart"/>
             <w:r>
               <w:t>adder.sv</w:t>
             </w:r>
+            <w:proofErr w:type="spellEnd"/>
           </w:p>
         </w:tc>
       </w:tr>
@@ -9293,12 +9528,14 @@
             <w:r>
               <w:t xml:space="preserve"> </w:t>
             </w:r>
+            <w:proofErr w:type="spellStart"/>
             <w:r>
               <w:rPr>
                 <w:rFonts w:hint="eastAsia"/>
               </w:rPr>
               <w:t>누산기</w:t>
             </w:r>
+            <w:proofErr w:type="spellEnd"/>
           </w:p>
         </w:tc>
       </w:tr>
@@ -9353,12 +9590,14 @@
                 <w:b/>
               </w:rPr>
             </w:pPr>
+            <w:proofErr w:type="spellStart"/>
             <w:r>
               <w:rPr>
                 <w:b/>
               </w:rPr>
               <w:t>ADDR_BIT</w:t>
             </w:r>
+            <w:proofErr w:type="spellEnd"/>
           </w:p>
         </w:tc>
       </w:tr>
@@ -9402,9 +9641,19 @@
             <w:pPr>
               <w:jc w:val="center"/>
             </w:pPr>
-            <w:r>
-              <w:t>u_addr_4_adder, u_branch_addr_adder</w:t>
-            </w:r>
+            <w:proofErr w:type="spellStart"/>
+            <w:r>
+              <w:t>u_addr_4_adder</w:t>
+            </w:r>
+            <w:proofErr w:type="spellEnd"/>
+            <w:r>
+              <w:t xml:space="preserve">, </w:t>
+            </w:r>
+            <w:proofErr w:type="spellStart"/>
+            <w:r>
+              <w:t>u_branch_addr_adder</w:t>
+            </w:r>
+            <w:proofErr w:type="spellEnd"/>
           </w:p>
         </w:tc>
       </w:tr>
@@ -9416,11 +9665,19 @@
       </w:pPr>
       <w:bookmarkStart w:id="34" w:name="_Toc230456445"/>
       <w:bookmarkStart w:id="35" w:name="_Toc230458229"/>
+      <w:proofErr w:type="spellStart"/>
       <w:r>
         <w:rPr>
           <w:rFonts w:hint="eastAsia"/>
         </w:rPr>
-        <w:t xml:space="preserve">누산기 </w:t>
+        <w:t>누산기</w:t>
+      </w:r>
+      <w:proofErr w:type="spellEnd"/>
+      <w:r>
+        <w:rPr>
+          <w:rFonts w:hint="eastAsia"/>
+        </w:rPr>
+        <w:t xml:space="preserve"> </w:t>
       </w:r>
       <w:r>
         <w:rPr>
@@ -9575,6 +9832,7 @@
                 <w:b/>
               </w:rPr>
             </w:pPr>
+            <w:proofErr w:type="spellStart"/>
             <w:r>
               <w:rPr>
                 <w:rFonts w:hint="eastAsia"/>
@@ -9582,6 +9840,7 @@
               </w:rPr>
               <w:t>신호명</w:t>
             </w:r>
+            <w:proofErr w:type="spellEnd"/>
           </w:p>
         </w:tc>
         <w:tc>
@@ -9694,9 +9953,11 @@
             <w:pPr>
               <w:jc w:val="center"/>
             </w:pPr>
+            <w:proofErr w:type="spellStart"/>
             <w:r>
               <w:t>i_i0</w:t>
             </w:r>
+            <w:proofErr w:type="spellEnd"/>
           </w:p>
         </w:tc>
         <w:tc>
@@ -9714,6 +9975,7 @@
                 <w:b/>
               </w:rPr>
             </w:pPr>
+            <w:proofErr w:type="spellStart"/>
             <w:r>
               <w:rPr>
                 <w:rFonts w:hint="eastAsia"/>
@@ -9727,6 +9989,7 @@
               </w:rPr>
               <w:t>DDR_BIT</w:t>
             </w:r>
+            <w:proofErr w:type="spellEnd"/>
           </w:p>
         </w:tc>
         <w:tc>
@@ -9803,6 +10066,7 @@
             <w:pPr>
               <w:jc w:val="center"/>
             </w:pPr>
+            <w:proofErr w:type="spellStart"/>
             <w:r>
               <w:rPr>
                 <w:rFonts w:hint="eastAsia"/>
@@ -9812,6 +10076,7 @@
             <w:r>
               <w:t>_i1</w:t>
             </w:r>
+            <w:proofErr w:type="spellEnd"/>
           </w:p>
         </w:tc>
         <w:tc>
@@ -9826,6 +10091,7 @@
                 <w:b/>
               </w:rPr>
             </w:pPr>
+            <w:proofErr w:type="spellStart"/>
             <w:r>
               <w:rPr>
                 <w:rFonts w:hint="eastAsia"/>
@@ -9839,6 +10105,7 @@
               </w:rPr>
               <w:t>DDR_BIT</w:t>
             </w:r>
+            <w:proofErr w:type="spellEnd"/>
           </w:p>
         </w:tc>
         <w:tc>
@@ -9918,6 +10185,7 @@
             <w:pPr>
               <w:jc w:val="center"/>
             </w:pPr>
+            <w:proofErr w:type="spellStart"/>
             <w:r>
               <w:rPr>
                 <w:rFonts w:hint="eastAsia"/>
@@ -9927,6 +10195,7 @@
             <w:r>
               <w:t>_o</w:t>
             </w:r>
+            <w:proofErr w:type="spellEnd"/>
           </w:p>
         </w:tc>
         <w:tc>
@@ -9941,6 +10210,7 @@
                 <w:b/>
               </w:rPr>
             </w:pPr>
+            <w:proofErr w:type="spellStart"/>
             <w:r>
               <w:rPr>
                 <w:rFonts w:hint="eastAsia"/>
@@ -9954,6 +10224,7 @@
               </w:rPr>
               <w:t>DDR_BIT</w:t>
             </w:r>
+            <w:proofErr w:type="spellEnd"/>
           </w:p>
         </w:tc>
         <w:tc>
@@ -9988,17 +10259,22 @@
     <w:p>
       <w:pPr>
         <w:pStyle w:val="3"/>
-        <w:rPr>
-          <w:rFonts w:hint="eastAsia"/>
-        </w:rPr>
       </w:pPr>
       <w:bookmarkStart w:id="40" w:name="_Toc230456446"/>
       <w:bookmarkStart w:id="41" w:name="_Toc230458230"/>
+      <w:proofErr w:type="spellStart"/>
       <w:r>
         <w:rPr>
           <w:rFonts w:hint="eastAsia"/>
         </w:rPr>
-        <w:t>누산기 설계 요구사항</w:t>
+        <w:t>누산기</w:t>
+      </w:r>
+      <w:proofErr w:type="spellEnd"/>
+      <w:r>
+        <w:rPr>
+          <w:rFonts w:hint="eastAsia"/>
+        </w:rPr>
+        <w:t xml:space="preserve"> 설계 요구사항</w:t>
       </w:r>
       <w:bookmarkEnd w:id="40"/>
       <w:bookmarkEnd w:id="41"/>
@@ -10024,15 +10300,25 @@
               </w:rPr>
               <w:t xml:space="preserve">1. </w:t>
             </w:r>
-            <w:r>
-              <w:rPr>
-                <w:rFonts w:hint="eastAsia"/>
-              </w:rPr>
-              <w:t xml:space="preserve">출력값 </w:t>
-            </w:r>
+            <w:proofErr w:type="spellStart"/>
+            <w:r>
+              <w:rPr>
+                <w:rFonts w:hint="eastAsia"/>
+              </w:rPr>
+              <w:t>출력값</w:t>
+            </w:r>
+            <w:proofErr w:type="spellEnd"/>
+            <w:r>
+              <w:rPr>
+                <w:rFonts w:hint="eastAsia"/>
+              </w:rPr>
+              <w:t xml:space="preserve"> </w:t>
+            </w:r>
+            <w:proofErr w:type="spellStart"/>
             <w:r>
               <w:t>o_o</w:t>
             </w:r>
+            <w:proofErr w:type="spellEnd"/>
             <w:r>
               <w:rPr>
                 <w:rFonts w:hint="eastAsia"/>
@@ -10048,9 +10334,15 @@
               </w:rPr>
               <w:t xml:space="preserve">개의 입력 </w:t>
             </w:r>
-            <w:r>
-              <w:t xml:space="preserve">i_i0, </w:t>
-            </w:r>
+            <w:proofErr w:type="spellStart"/>
+            <w:r>
+              <w:t>i_i0</w:t>
+            </w:r>
+            <w:proofErr w:type="spellEnd"/>
+            <w:r>
+              <w:t xml:space="preserve">, </w:t>
+            </w:r>
+            <w:proofErr w:type="spellStart"/>
             <w:r>
               <w:rPr>
                 <w:rFonts w:hint="eastAsia"/>
@@ -10060,6 +10352,7 @@
             <w:r>
               <w:t>_i1</w:t>
             </w:r>
+            <w:proofErr w:type="spellEnd"/>
             <w:r>
               <w:rPr>
                 <w:rFonts w:hint="eastAsia"/>
@@ -10146,6 +10439,9 @@
         <w:jc w:val="center"/>
       </w:pPr>
       <w:r>
+        <w:rPr>
+          <w:noProof/>
+        </w:rPr>
         <w:drawing>
           <wp:inline distT="0" distB="0" distL="0" distR="0" wp14:anchorId="69A55BDB" wp14:editId="07C1D6F3">
             <wp:extent cx="3010320" cy="2524477"/>
@@ -10250,11 +10546,6 @@
       <w:bookmarkEnd w:id="50"/>
     </w:p>
     <w:p>
-      <w:pPr>
-        <w:rPr>
-          <w:rFonts w:hint="eastAsia"/>
-        </w:rPr>
-      </w:pPr>
       <w:r>
         <w:t>ALU</w:t>
       </w:r>
@@ -10365,6 +10656,7 @@
                 <w:b/>
               </w:rPr>
             </w:pPr>
+            <w:proofErr w:type="spellStart"/>
             <w:r>
               <w:rPr>
                 <w:rFonts w:hint="eastAsia"/>
@@ -10372,6 +10664,7 @@
               </w:rPr>
               <w:t>모듈명</w:t>
             </w:r>
+            <w:proofErr w:type="spellEnd"/>
           </w:p>
         </w:tc>
         <w:tc>
@@ -10460,9 +10753,11 @@
             <w:pPr>
               <w:jc w:val="center"/>
             </w:pPr>
+            <w:proofErr w:type="spellStart"/>
             <w:r>
               <w:t>alu.sv</w:t>
             </w:r>
+            <w:proofErr w:type="spellEnd"/>
           </w:p>
         </w:tc>
       </w:tr>
@@ -10514,9 +10809,11 @@
             <w:pPr>
               <w:jc w:val="center"/>
             </w:pPr>
+            <w:proofErr w:type="spellStart"/>
             <w:r>
               <w:t>Instruction.svh</w:t>
             </w:r>
+            <w:proofErr w:type="spellEnd"/>
           </w:p>
         </w:tc>
       </w:tr>
@@ -10621,6 +10918,7 @@
                 <w:b/>
               </w:rPr>
             </w:pPr>
+            <w:proofErr w:type="spellStart"/>
             <w:r>
               <w:rPr>
                 <w:b/>
@@ -10633,6 +10931,7 @@
               </w:rPr>
               <w:t>_BIT</w:t>
             </w:r>
+            <w:proofErr w:type="spellEnd"/>
           </w:p>
         </w:tc>
       </w:tr>
@@ -10676,9 +10975,11 @@
             <w:pPr>
               <w:jc w:val="center"/>
             </w:pPr>
+            <w:proofErr w:type="spellStart"/>
             <w:r>
               <w:t>u_alu</w:t>
             </w:r>
+            <w:proofErr w:type="spellEnd"/>
           </w:p>
         </w:tc>
       </w:tr>
@@ -10843,6 +11144,7 @@
                 <w:b/>
               </w:rPr>
             </w:pPr>
+            <w:proofErr w:type="spellStart"/>
             <w:r>
               <w:rPr>
                 <w:rFonts w:hint="eastAsia"/>
@@ -10850,6 +11152,7 @@
               </w:rPr>
               <w:t>신호명</w:t>
             </w:r>
+            <w:proofErr w:type="spellEnd"/>
           </w:p>
         </w:tc>
         <w:tc>
@@ -10962,9 +11265,11 @@
             <w:pPr>
               <w:jc w:val="center"/>
             </w:pPr>
+            <w:proofErr w:type="spellStart"/>
             <w:r>
               <w:t>i_in0</w:t>
             </w:r>
+            <w:proofErr w:type="spellEnd"/>
           </w:p>
         </w:tc>
         <w:tc>
@@ -10982,6 +11287,7 @@
                 <w:b/>
               </w:rPr>
             </w:pPr>
+            <w:proofErr w:type="spellStart"/>
             <w:r>
               <w:rPr>
                 <w:rFonts w:hint="eastAsia"/>
@@ -10995,6 +11301,7 @@
               </w:rPr>
               <w:t>ATA_BIT</w:t>
             </w:r>
+            <w:proofErr w:type="spellEnd"/>
           </w:p>
         </w:tc>
         <w:tc>
@@ -11065,6 +11372,7 @@
             <w:pPr>
               <w:jc w:val="center"/>
             </w:pPr>
+            <w:proofErr w:type="spellStart"/>
             <w:r>
               <w:rPr>
                 <w:rFonts w:hint="eastAsia"/>
@@ -11074,6 +11382,7 @@
             <w:r>
               <w:t>_in1</w:t>
             </w:r>
+            <w:proofErr w:type="spellEnd"/>
           </w:p>
         </w:tc>
         <w:tc>
@@ -11088,6 +11397,7 @@
                 <w:b/>
               </w:rPr>
             </w:pPr>
+            <w:proofErr w:type="spellStart"/>
             <w:r>
               <w:rPr>
                 <w:rFonts w:hint="eastAsia"/>
@@ -11101,6 +11411,7 @@
               </w:rPr>
               <w:t>ATA_BIT</w:t>
             </w:r>
+            <w:proofErr w:type="spellEnd"/>
           </w:p>
         </w:tc>
         <w:tc>
@@ -11174,6 +11485,7 @@
             <w:pPr>
               <w:jc w:val="center"/>
             </w:pPr>
+            <w:proofErr w:type="spellStart"/>
             <w:r>
               <w:rPr>
                 <w:rFonts w:hint="eastAsia"/>
@@ -11183,6 +11495,7 @@
             <w:r>
               <w:t>_carry</w:t>
             </w:r>
+            <w:proofErr w:type="spellEnd"/>
           </w:p>
         </w:tc>
         <w:tc>
@@ -11273,6 +11586,7 @@
             <w:pPr>
               <w:jc w:val="center"/>
             </w:pPr>
+            <w:proofErr w:type="spellStart"/>
             <w:r>
               <w:rPr>
                 <w:rFonts w:hint="eastAsia"/>
@@ -11282,6 +11596,7 @@
             <w:r>
               <w:t>_aluop</w:t>
             </w:r>
+            <w:proofErr w:type="spellEnd"/>
           </w:p>
         </w:tc>
         <w:tc>
@@ -11310,6 +11625,7 @@
             <w:pPr>
               <w:jc w:val="left"/>
             </w:pPr>
+            <w:proofErr w:type="spellStart"/>
             <w:r>
               <w:rPr>
                 <w:rFonts w:hint="eastAsia"/>
@@ -11319,6 +11635,7 @@
             <w:r>
               <w:t>LUOpB</w:t>
             </w:r>
+            <w:proofErr w:type="spellEnd"/>
           </w:p>
         </w:tc>
       </w:tr>
@@ -11369,6 +11686,7 @@
             <w:pPr>
               <w:jc w:val="center"/>
             </w:pPr>
+            <w:proofErr w:type="spellStart"/>
             <w:r>
               <w:rPr>
                 <w:rFonts w:hint="eastAsia"/>
@@ -11378,6 +11696,7 @@
             <w:r>
               <w:t>_out</w:t>
             </w:r>
+            <w:proofErr w:type="spellEnd"/>
           </w:p>
         </w:tc>
         <w:tc>
@@ -11392,6 +11711,7 @@
                 <w:b/>
               </w:rPr>
             </w:pPr>
+            <w:proofErr w:type="spellStart"/>
             <w:r>
               <w:rPr>
                 <w:rFonts w:hint="eastAsia"/>
@@ -11405,6 +11725,7 @@
               </w:rPr>
               <w:t>ATA_BIT</w:t>
             </w:r>
+            <w:proofErr w:type="spellEnd"/>
           </w:p>
         </w:tc>
         <w:tc>
@@ -11475,6 +11796,7 @@
             <w:pPr>
               <w:jc w:val="center"/>
             </w:pPr>
+            <w:proofErr w:type="spellStart"/>
             <w:r>
               <w:rPr>
                 <w:rFonts w:hint="eastAsia"/>
@@ -11484,6 +11806,7 @@
             <w:r>
               <w:t>_carry</w:t>
             </w:r>
+            <w:proofErr w:type="spellEnd"/>
           </w:p>
         </w:tc>
         <w:tc>
@@ -11577,6 +11900,7 @@
             <w:pPr>
               <w:jc w:val="center"/>
             </w:pPr>
+            <w:proofErr w:type="spellStart"/>
             <w:r>
               <w:rPr>
                 <w:rFonts w:hint="eastAsia"/>
@@ -11586,6 +11910,7 @@
             <w:r>
               <w:t>_zero</w:t>
             </w:r>
+            <w:proofErr w:type="spellEnd"/>
           </w:p>
         </w:tc>
         <w:tc>
@@ -11634,9 +11959,6 @@
     <w:p>
       <w:pPr>
         <w:pStyle w:val="3"/>
-        <w:rPr>
-          <w:rFonts w:hint="eastAsia"/>
-        </w:rPr>
       </w:pPr>
       <w:bookmarkStart w:id="55" w:name="_Toc230456450"/>
       <w:bookmarkStart w:id="56" w:name="_Toc230458234"/>
@@ -11673,33 +11995,67 @@
               </w:rPr>
               <w:t xml:space="preserve">1. </w:t>
             </w:r>
-            <w:r>
-              <w:rPr>
-                <w:rFonts w:hint="eastAsia"/>
-              </w:rPr>
-              <w:t xml:space="preserve">출력값 </w:t>
-            </w:r>
+            <w:proofErr w:type="spellStart"/>
+            <w:r>
+              <w:rPr>
+                <w:rFonts w:hint="eastAsia"/>
+              </w:rPr>
+              <w:t>출력값</w:t>
+            </w:r>
+            <w:proofErr w:type="spellEnd"/>
+            <w:r>
+              <w:rPr>
+                <w:rFonts w:hint="eastAsia"/>
+              </w:rPr>
+              <w:t xml:space="preserve"> </w:t>
+            </w:r>
+            <w:proofErr w:type="spellStart"/>
             <w:r>
               <w:t>o_out</w:t>
             </w:r>
-            <w:r>
-              <w:rPr>
-                <w:rFonts w:hint="eastAsia"/>
-              </w:rPr>
-              <w:t>은i</w:t>
+            <w:proofErr w:type="spellEnd"/>
+            <w:r>
+              <w:rPr>
+                <w:rFonts w:hint="eastAsia"/>
+              </w:rPr>
+              <w:t>은</w:t>
+            </w:r>
+            <w:proofErr w:type="spellStart"/>
+            <w:r>
+              <w:rPr>
+                <w:rFonts w:hint="eastAsia"/>
+              </w:rPr>
+              <w:t>i</w:t>
             </w:r>
             <w:r>
               <w:t>_aluop</w:t>
             </w:r>
-            <w:r>
-              <w:rPr>
-                <w:rFonts w:hint="eastAsia"/>
-              </w:rPr>
-              <w:t>에 따라 i</w:t>
-            </w:r>
-            <w:r>
-              <w:t>_in0, i_in1</w:t>
-            </w:r>
+            <w:proofErr w:type="spellEnd"/>
+            <w:r>
+              <w:rPr>
+                <w:rFonts w:hint="eastAsia"/>
+              </w:rPr>
+              <w:t xml:space="preserve">에 따라 </w:t>
+            </w:r>
+            <w:proofErr w:type="spellStart"/>
+            <w:r>
+              <w:rPr>
+                <w:rFonts w:hint="eastAsia"/>
+              </w:rPr>
+              <w:t>i</w:t>
+            </w:r>
+            <w:r>
+              <w:t>_in0</w:t>
+            </w:r>
+            <w:proofErr w:type="spellEnd"/>
+            <w:r>
+              <w:t xml:space="preserve">, </w:t>
+            </w:r>
+            <w:proofErr w:type="spellStart"/>
+            <w:r>
+              <w:t>i_in1</w:t>
+            </w:r>
+            <w:proofErr w:type="spellEnd"/>
             <w:r>
               <w:rPr>
                 <w:rFonts w:hint="eastAsia"/>
@@ -11717,15 +12073,25 @@
             <w:r>
               <w:t xml:space="preserve">. </w:t>
             </w:r>
-            <w:r>
-              <w:rPr>
-                <w:rFonts w:hint="eastAsia"/>
-              </w:rPr>
-              <w:t xml:space="preserve">출력값 </w:t>
-            </w:r>
+            <w:proofErr w:type="spellStart"/>
+            <w:r>
+              <w:rPr>
+                <w:rFonts w:hint="eastAsia"/>
+              </w:rPr>
+              <w:t>출력값</w:t>
+            </w:r>
+            <w:proofErr w:type="spellEnd"/>
+            <w:r>
+              <w:rPr>
+                <w:rFonts w:hint="eastAsia"/>
+              </w:rPr>
+              <w:t xml:space="preserve"> </w:t>
+            </w:r>
+            <w:proofErr w:type="spellStart"/>
             <w:r>
               <w:t>o_carry</w:t>
             </w:r>
+            <w:proofErr w:type="spellEnd"/>
             <w:r>
               <w:rPr>
                 <w:rFonts w:hint="eastAsia"/>
@@ -11741,9 +12107,11 @@
               </w:rPr>
               <w:t xml:space="preserve">가 발생할 경우에만 </w:t>
             </w:r>
+            <w:proofErr w:type="spellStart"/>
             <w:r>
               <w:t>1’b1</w:t>
             </w:r>
+            <w:proofErr w:type="spellEnd"/>
             <w:r>
               <w:rPr>
                 <w:rFonts w:hint="eastAsia"/>
@@ -11761,42 +12129,58 @@
             <w:r>
               <w:t xml:space="preserve">. </w:t>
             </w:r>
-            <w:r>
-              <w:rPr>
-                <w:rFonts w:hint="eastAsia"/>
-              </w:rPr>
-              <w:t xml:space="preserve">출력값 </w:t>
-            </w:r>
+            <w:proofErr w:type="spellStart"/>
+            <w:r>
+              <w:rPr>
+                <w:rFonts w:hint="eastAsia"/>
+              </w:rPr>
+              <w:t>출력값</w:t>
+            </w:r>
+            <w:proofErr w:type="spellEnd"/>
+            <w:r>
+              <w:rPr>
+                <w:rFonts w:hint="eastAsia"/>
+              </w:rPr>
+              <w:t xml:space="preserve"> </w:t>
+            </w:r>
+            <w:proofErr w:type="spellStart"/>
             <w:r>
               <w:t>o_zero</w:t>
             </w:r>
+            <w:proofErr w:type="spellEnd"/>
             <w:r>
               <w:rPr>
                 <w:rFonts w:hint="eastAsia"/>
               </w:rPr>
               <w:t xml:space="preserve">는 </w:t>
             </w:r>
+            <w:proofErr w:type="spellStart"/>
             <w:r>
               <w:t>i_aluop</w:t>
             </w:r>
+            <w:proofErr w:type="spellEnd"/>
             <w:r>
               <w:rPr>
                 <w:rFonts w:hint="eastAsia"/>
               </w:rPr>
               <w:t xml:space="preserve">가 </w:t>
             </w:r>
+            <w:proofErr w:type="spellStart"/>
             <w:r>
               <w:t>ALU_CTR_SUB</w:t>
             </w:r>
+            <w:proofErr w:type="spellEnd"/>
             <w:r>
               <w:rPr>
                 <w:rFonts w:hint="eastAsia"/>
               </w:rPr>
               <w:t xml:space="preserve">이고 </w:t>
             </w:r>
+            <w:proofErr w:type="spellStart"/>
             <w:r>
               <w:t>o_out</w:t>
             </w:r>
+            <w:proofErr w:type="spellEnd"/>
             <w:r>
               <w:rPr>
                 <w:rFonts w:hint="eastAsia"/>
@@ -11804,14 +12188,20 @@
               <w:t xml:space="preserve">이 </w:t>
             </w:r>
             <w:r>
-              <w:t>‘d0</w:t>
-            </w:r>
+              <w:t>‘</w:t>
+            </w:r>
+            <w:proofErr w:type="spellStart"/>
+            <w:r>
+              <w:t>d0</w:t>
+            </w:r>
+            <w:proofErr w:type="spellEnd"/>
             <w:r>
               <w:rPr>
                 <w:rFonts w:hint="eastAsia"/>
               </w:rPr>
               <w:t xml:space="preserve">인 경우에만 </w:t>
             </w:r>
+            <w:proofErr w:type="spellStart"/>
             <w:r>
               <w:t>1’</w:t>
             </w:r>
@@ -11824,6 +12214,7 @@
             <w:r>
               <w:t>1</w:t>
             </w:r>
+            <w:proofErr w:type="spellEnd"/>
             <w:r>
               <w:rPr>
                 <w:rFonts w:hint="eastAsia"/>
@@ -11840,13 +12231,7 @@
         </w:tc>
       </w:tr>
     </w:tbl>
-    <w:p>
-      <w:pPr>
-        <w:rPr>
-          <w:rFonts w:hint="eastAsia"/>
-        </w:rPr>
-      </w:pPr>
-    </w:p>
+    <w:p/>
     <w:p>
       <w:pPr>
         <w:pStyle w:val="2"/>
@@ -11923,6 +12308,9 @@
         <w:jc w:val="center"/>
       </w:pPr>
       <w:r>
+        <w:rPr>
+          <w:noProof/>
+        </w:rPr>
         <w:drawing>
           <wp:inline distT="0" distB="0" distL="0" distR="0" wp14:anchorId="6164399C" wp14:editId="5D030803">
             <wp:extent cx="3162741" cy="2457793"/>
@@ -12122,6 +12510,7 @@
                 <w:b/>
               </w:rPr>
             </w:pPr>
+            <w:proofErr w:type="spellStart"/>
             <w:r>
               <w:rPr>
                 <w:rFonts w:hint="eastAsia"/>
@@ -12129,6 +12518,7 @@
               </w:rPr>
               <w:t>모듈명</w:t>
             </w:r>
+            <w:proofErr w:type="spellEnd"/>
           </w:p>
         </w:tc>
         <w:tc>
@@ -12142,16 +12532,12 @@
           <w:p>
             <w:pPr>
               <w:jc w:val="center"/>
-              <w:rPr>
-                <w:rFonts w:hint="eastAsia"/>
-              </w:rPr>
-            </w:pPr>
-            <w:r>
-              <w:t>alu</w:t>
-            </w:r>
-            <w:r>
-              <w:t>_ctr</w:t>
-            </w:r>
+            </w:pPr>
+            <w:proofErr w:type="spellStart"/>
+            <w:r>
+              <w:t>alu_ctr</w:t>
+            </w:r>
+            <w:proofErr w:type="spellEnd"/>
           </w:p>
         </w:tc>
         <w:tc>
@@ -12223,15 +12609,11 @@
             <w:pPr>
               <w:jc w:val="center"/>
             </w:pPr>
-            <w:r>
-              <w:t>alu</w:t>
-            </w:r>
-            <w:r>
-              <w:t>_ctr</w:t>
-            </w:r>
-            <w:r>
-              <w:t>.sv</w:t>
-            </w:r>
+            <w:proofErr w:type="spellStart"/>
+            <w:r>
+              <w:t>alu_ctr.sv</w:t>
+            </w:r>
+            <w:proofErr w:type="spellEnd"/>
           </w:p>
         </w:tc>
       </w:tr>
@@ -12283,9 +12665,11 @@
             <w:pPr>
               <w:jc w:val="center"/>
             </w:pPr>
+            <w:proofErr w:type="spellStart"/>
             <w:r>
               <w:t>Instruction.svh</w:t>
             </w:r>
+            <w:proofErr w:type="spellEnd"/>
           </w:p>
         </w:tc>
       </w:tr>
@@ -12399,6 +12783,7 @@
                 <w:b/>
               </w:rPr>
             </w:pPr>
+            <w:proofErr w:type="spellStart"/>
             <w:r>
               <w:rPr>
                 <w:b/>
@@ -12411,6 +12796,7 @@
               </w:rPr>
               <w:t>_BIT</w:t>
             </w:r>
+            <w:proofErr w:type="spellEnd"/>
           </w:p>
         </w:tc>
       </w:tr>
@@ -12454,12 +12840,14 @@
             <w:pPr>
               <w:jc w:val="center"/>
             </w:pPr>
+            <w:proofErr w:type="spellStart"/>
             <w:r>
               <w:t>u_alu</w:t>
             </w:r>
             <w:r>
               <w:t>_control</w:t>
             </w:r>
+            <w:proofErr w:type="spellEnd"/>
           </w:p>
         </w:tc>
       </w:tr>
@@ -12624,6 +13012,7 @@
                 <w:b/>
               </w:rPr>
             </w:pPr>
+            <w:proofErr w:type="spellStart"/>
             <w:r>
               <w:rPr>
                 <w:rFonts w:hint="eastAsia"/>
@@ -12631,6 +13020,7 @@
               </w:rPr>
               <w:t>신호명</w:t>
             </w:r>
+            <w:proofErr w:type="spellEnd"/>
           </w:p>
         </w:tc>
         <w:tc>
@@ -12743,12 +13133,11 @@
             <w:pPr>
               <w:jc w:val="center"/>
             </w:pPr>
-            <w:r>
-              <w:t>i_</w:t>
-            </w:r>
-            <w:r>
-              <w:t>funct</w:t>
-            </w:r>
+            <w:proofErr w:type="spellStart"/>
+            <w:r>
+              <w:t>i_funct</w:t>
+            </w:r>
+            <w:proofErr w:type="spellEnd"/>
           </w:p>
         </w:tc>
         <w:tc>
@@ -12860,6 +13249,7 @@
             <w:pPr>
               <w:jc w:val="center"/>
             </w:pPr>
+            <w:proofErr w:type="spellStart"/>
             <w:r>
               <w:rPr>
                 <w:rFonts w:hint="eastAsia"/>
@@ -12867,11 +13257,9 @@
               <w:t>i</w:t>
             </w:r>
             <w:r>
-              <w:t>_</w:t>
-            </w:r>
-            <w:r>
-              <w:t>aluop</w:t>
-            </w:r>
+              <w:t>_aluop</w:t>
+            </w:r>
+            <w:proofErr w:type="spellEnd"/>
           </w:p>
         </w:tc>
         <w:tc>
@@ -12903,6 +13291,7 @@
             <w:pPr>
               <w:jc w:val="left"/>
             </w:pPr>
+            <w:proofErr w:type="spellStart"/>
             <w:r>
               <w:rPr>
                 <w:rFonts w:hint="eastAsia"/>
@@ -12910,11 +13299,9 @@
               <w:t>A</w:t>
             </w:r>
             <w:r>
-              <w:t>LUOp</w:t>
-            </w:r>
-            <w:r>
-              <w:t>A</w:t>
-            </w:r>
+              <w:t>LUOpA</w:t>
+            </w:r>
+            <w:proofErr w:type="spellEnd"/>
           </w:p>
         </w:tc>
       </w:tr>
@@ -12965,6 +13352,7 @@
             <w:pPr>
               <w:jc w:val="center"/>
             </w:pPr>
+            <w:proofErr w:type="spellStart"/>
             <w:r>
               <w:rPr>
                 <w:rFonts w:hint="eastAsia"/>
@@ -12974,6 +13362,7 @@
             <w:r>
               <w:t>_aluop</w:t>
             </w:r>
+            <w:proofErr w:type="spellEnd"/>
           </w:p>
         </w:tc>
         <w:tc>
@@ -13002,6 +13391,7 @@
             <w:pPr>
               <w:jc w:val="left"/>
             </w:pPr>
+            <w:proofErr w:type="spellStart"/>
             <w:r>
               <w:rPr>
                 <w:rFonts w:hint="eastAsia"/>
@@ -13011,6 +13401,7 @@
             <w:r>
               <w:t>LUOpB</w:t>
             </w:r>
+            <w:proofErr w:type="spellEnd"/>
           </w:p>
         </w:tc>
       </w:tr>
@@ -13055,44 +13446,67 @@
             <w:tcW w:w="9016" w:type="dxa"/>
           </w:tcPr>
           <w:p>
-            <w:pPr>
-              <w:rPr>
-                <w:rFonts w:hint="eastAsia"/>
-              </w:rPr>
-            </w:pPr>
             <w:r>
               <w:rPr>
                 <w:rFonts w:hint="eastAsia"/>
               </w:rPr>
               <w:t xml:space="preserve">1. </w:t>
             </w:r>
-            <w:r>
-              <w:rPr>
-                <w:rFonts w:hint="eastAsia"/>
-              </w:rPr>
-              <w:t xml:space="preserve">출력값 </w:t>
-            </w:r>
+            <w:proofErr w:type="spellStart"/>
+            <w:r>
+              <w:rPr>
+                <w:rFonts w:hint="eastAsia"/>
+              </w:rPr>
+              <w:t>출력값</w:t>
+            </w:r>
+            <w:proofErr w:type="spellEnd"/>
+            <w:r>
+              <w:rPr>
+                <w:rFonts w:hint="eastAsia"/>
+              </w:rPr>
+              <w:t xml:space="preserve"> </w:t>
+            </w:r>
+            <w:proofErr w:type="spellStart"/>
             <w:r>
               <w:t>o_aluop</w:t>
             </w:r>
-            <w:r>
-              <w:rPr>
-                <w:rFonts w:hint="eastAsia"/>
-              </w:rPr>
-              <w:t xml:space="preserve">는 입력값 </w:t>
-            </w:r>
+            <w:proofErr w:type="spellEnd"/>
+            <w:r>
+              <w:rPr>
+                <w:rFonts w:hint="eastAsia"/>
+              </w:rPr>
+              <w:t xml:space="preserve">는 </w:t>
+            </w:r>
+            <w:proofErr w:type="spellStart"/>
+            <w:r>
+              <w:rPr>
+                <w:rFonts w:hint="eastAsia"/>
+              </w:rPr>
+              <w:t>입력값</w:t>
+            </w:r>
+            <w:proofErr w:type="spellEnd"/>
+            <w:r>
+              <w:rPr>
+                <w:rFonts w:hint="eastAsia"/>
+              </w:rPr>
+              <w:t xml:space="preserve"> </w:t>
+            </w:r>
+            <w:proofErr w:type="spellStart"/>
             <w:r>
               <w:t>i_funct</w:t>
             </w:r>
+            <w:proofErr w:type="spellEnd"/>
             <w:r>
               <w:rPr>
                 <w:rFonts w:hint="eastAsia"/>
               </w:rPr>
               <w:t xml:space="preserve">와 </w:t>
             </w:r>
+            <w:proofErr w:type="spellStart"/>
             <w:r>
               <w:t>i_aluop</w:t>
             </w:r>
+            <w:proofErr w:type="spellEnd"/>
             <w:r>
               <w:rPr>
                 <w:rFonts w:hint="eastAsia"/>
@@ -13103,13 +13517,7 @@
         </w:tc>
       </w:tr>
     </w:tbl>
-    <w:p>
-      <w:pPr>
-        <w:rPr>
-          <w:rFonts w:hint="eastAsia"/>
-        </w:rPr>
-      </w:pPr>
-    </w:p>
+    <w:p/>
     <w:p>
       <w:pPr>
         <w:pStyle w:val="2"/>
@@ -13146,11 +13554,6 @@
       <w:bookmarkEnd w:id="74"/>
     </w:p>
     <w:p>
-      <w:pPr>
-        <w:rPr>
-          <w:rFonts w:hint="eastAsia"/>
-        </w:rPr>
-      </w:pPr>
       <w:r>
         <w:rPr>
           <w:rFonts w:hint="eastAsia"/>
@@ -13259,6 +13662,9 @@
         <w:jc w:val="center"/>
       </w:pPr>
       <w:r>
+        <w:rPr>
+          <w:noProof/>
+        </w:rPr>
         <w:drawing>
           <wp:inline distT="0" distB="0" distL="0" distR="0" wp14:anchorId="3C663F1A" wp14:editId="398F9D14">
             <wp:extent cx="3905795" cy="2524477"/>
@@ -13334,11 +13740,6 @@
       <w:bookmarkEnd w:id="77"/>
     </w:p>
     <w:p>
-      <w:pPr>
-        <w:rPr>
-          <w:rFonts w:hint="eastAsia"/>
-        </w:rPr>
-      </w:pPr>
       <w:r>
         <w:rPr>
           <w:rFonts w:hint="eastAsia"/>
@@ -13455,6 +13856,7 @@
                 <w:b/>
               </w:rPr>
             </w:pPr>
+            <w:proofErr w:type="spellStart"/>
             <w:r>
               <w:rPr>
                 <w:rFonts w:hint="eastAsia"/>
@@ -13462,6 +13864,7 @@
               </w:rPr>
               <w:t>모듈명</w:t>
             </w:r>
+            <w:proofErr w:type="spellEnd"/>
           </w:p>
         </w:tc>
         <w:tc>
@@ -13475,10 +13878,8 @@
           <w:p>
             <w:pPr>
               <w:jc w:val="center"/>
-              <w:rPr>
-                <w:rFonts w:hint="eastAsia"/>
-              </w:rPr>
-            </w:pPr>
+            </w:pPr>
+            <w:proofErr w:type="spellStart"/>
             <w:r>
               <w:rPr>
                 <w:rFonts w:hint="eastAsia"/>
@@ -13488,6 +13889,7 @@
             <w:r>
               <w:t>f_id_bridge</w:t>
             </w:r>
+            <w:proofErr w:type="spellEnd"/>
           </w:p>
         </w:tc>
         <w:tc>
@@ -13559,12 +13961,11 @@
             <w:pPr>
               <w:jc w:val="center"/>
             </w:pPr>
-            <w:r>
-              <w:t>bridge.</w:t>
-            </w:r>
-            <w:r>
-              <w:t>sv</w:t>
-            </w:r>
+            <w:proofErr w:type="spellStart"/>
+            <w:r>
+              <w:t>bridge.sv</w:t>
+            </w:r>
+            <w:proofErr w:type="spellEnd"/>
           </w:p>
         </w:tc>
       </w:tr>
@@ -13665,9 +14066,6 @@
           <w:p>
             <w:pPr>
               <w:jc w:val="center"/>
-              <w:rPr>
-                <w:rFonts w:hint="eastAsia"/>
-              </w:rPr>
             </w:pPr>
             <w:r>
               <w:rPr>
@@ -13738,6 +14136,7 @@
                 <w:b/>
               </w:rPr>
             </w:pPr>
+            <w:proofErr w:type="spellStart"/>
             <w:r>
               <w:rPr>
                 <w:b/>
@@ -13750,12 +14149,21 @@
               </w:rPr>
               <w:t>_BIT</w:t>
             </w:r>
-            <w:r>
-              <w:rPr>
-                <w:b/>
-              </w:rPr>
-              <w:t>, ADDR_BIT</w:t>
-            </w:r>
+            <w:proofErr w:type="spellEnd"/>
+            <w:r>
+              <w:rPr>
+                <w:b/>
+              </w:rPr>
+              <w:t xml:space="preserve">, </w:t>
+            </w:r>
+            <w:proofErr w:type="spellStart"/>
+            <w:r>
+              <w:rPr>
+                <w:b/>
+              </w:rPr>
+              <w:t>ADDR_BIT</w:t>
+            </w:r>
+            <w:proofErr w:type="spellEnd"/>
           </w:p>
         </w:tc>
       </w:tr>
@@ -13799,23 +14207,16 @@
             <w:pPr>
               <w:jc w:val="center"/>
             </w:pPr>
-            <w:r>
-              <w:t>u_</w:t>
-            </w:r>
-            <w:r>
-              <w:t>if_id_bridge</w:t>
-            </w:r>
+            <w:proofErr w:type="spellStart"/>
+            <w:r>
+              <w:t>u_if_id_bridge</w:t>
+            </w:r>
+            <w:proofErr w:type="spellEnd"/>
           </w:p>
         </w:tc>
       </w:tr>
     </w:tbl>
-    <w:p>
-      <w:pPr>
-        <w:rPr>
-          <w:rFonts w:hint="eastAsia"/>
-        </w:rPr>
-      </w:pPr>
-    </w:p>
+    <w:p/>
     <w:p>
       <w:pPr>
         <w:pStyle w:val="4"/>
@@ -13971,6 +14372,7 @@
                 <w:b/>
               </w:rPr>
             </w:pPr>
+            <w:proofErr w:type="spellStart"/>
             <w:r>
               <w:rPr>
                 <w:rFonts w:hint="eastAsia"/>
@@ -13978,6 +14380,7 @@
               </w:rPr>
               <w:t>신호명</w:t>
             </w:r>
+            <w:proofErr w:type="spellEnd"/>
           </w:p>
         </w:tc>
         <w:tc>
@@ -14089,10 +14492,8 @@
           <w:p>
             <w:pPr>
               <w:jc w:val="center"/>
-              <w:rPr>
-                <w:rFonts w:hint="eastAsia"/>
-              </w:rPr>
-            </w:pPr>
+            </w:pPr>
+            <w:proofErr w:type="spellStart"/>
             <w:r>
               <w:rPr>
                 <w:rFonts w:hint="eastAsia"/>
@@ -14102,6 +14503,7 @@
             <w:r>
               <w:t>lk</w:t>
             </w:r>
+            <w:proofErr w:type="spellEnd"/>
           </w:p>
         </w:tc>
         <w:tc>
@@ -14199,6 +14601,7 @@
             <w:pPr>
               <w:jc w:val="center"/>
             </w:pPr>
+            <w:proofErr w:type="spellStart"/>
             <w:r>
               <w:rPr>
                 <w:rFonts w:hint="eastAsia"/>
@@ -14208,6 +14611,7 @@
             <w:r>
               <w:t>st_n</w:t>
             </w:r>
+            <w:proofErr w:type="spellEnd"/>
           </w:p>
         </w:tc>
         <w:tc>
@@ -14264,9 +14668,6 @@
           <w:p>
             <w:pPr>
               <w:jc w:val="center"/>
-              <w:rPr>
-                <w:rFonts w:hint="eastAsia"/>
-              </w:rPr>
             </w:pPr>
             <w:r>
               <w:rPr>
@@ -14298,10 +14699,8 @@
           <w:p>
             <w:pPr>
               <w:jc w:val="center"/>
-              <w:rPr>
-                <w:rFonts w:hint="eastAsia"/>
-              </w:rPr>
-            </w:pPr>
+            </w:pPr>
+            <w:proofErr w:type="spellStart"/>
             <w:r>
               <w:rPr>
                 <w:rFonts w:hint="eastAsia"/>
@@ -14311,6 +14710,7 @@
             <w:r>
               <w:t>_flush</w:t>
             </w:r>
+            <w:proofErr w:type="spellEnd"/>
           </w:p>
         </w:tc>
         <w:tc>
@@ -14342,9 +14742,6 @@
           <w:p>
             <w:pPr>
               <w:jc w:val="left"/>
-              <w:rPr>
-                <w:rFonts w:hint="eastAsia"/>
-              </w:rPr>
             </w:pPr>
             <w:r>
               <w:rPr>
@@ -14397,6 +14794,7 @@
             <w:pPr>
               <w:jc w:val="center"/>
             </w:pPr>
+            <w:proofErr w:type="spellStart"/>
             <w:r>
               <w:rPr>
                 <w:rFonts w:hint="eastAsia"/>
@@ -14406,6 +14804,7 @@
             <w:r>
               <w:t>_stall</w:t>
             </w:r>
+            <w:proofErr w:type="spellEnd"/>
           </w:p>
         </w:tc>
         <w:tc>
@@ -14456,9 +14855,6 @@
           <w:p>
             <w:pPr>
               <w:jc w:val="center"/>
-              <w:rPr>
-                <w:rFonts w:hint="eastAsia"/>
-              </w:rPr>
             </w:pPr>
             <w:r>
               <w:rPr>
@@ -14476,9 +14872,6 @@
           <w:p>
             <w:pPr>
               <w:jc w:val="center"/>
-              <w:rPr>
-                <w:rFonts w:hint="eastAsia"/>
-              </w:rPr>
             </w:pPr>
             <w:r>
               <w:t>input</w:t>
@@ -14493,10 +14886,8 @@
           <w:p>
             <w:pPr>
               <w:jc w:val="center"/>
-              <w:rPr>
-                <w:rFonts w:hint="eastAsia"/>
-              </w:rPr>
-            </w:pPr>
+            </w:pPr>
+            <w:proofErr w:type="spellStart"/>
             <w:r>
               <w:rPr>
                 <w:rFonts w:hint="eastAsia"/>
@@ -14506,6 +14897,7 @@
             <w:r>
               <w:t>_i_mem_data</w:t>
             </w:r>
+            <w:proofErr w:type="spellEnd"/>
           </w:p>
         </w:tc>
         <w:tc>
@@ -14517,10 +14909,10 @@
             <w:pPr>
               <w:jc w:val="center"/>
               <w:rPr>
-                <w:rFonts w:hint="eastAsia"/>
-                <w:b/>
-              </w:rPr>
-            </w:pPr>
+                <w:b/>
+              </w:rPr>
+            </w:pPr>
+            <w:proofErr w:type="spellStart"/>
             <w:r>
               <w:rPr>
                 <w:rFonts w:hint="eastAsia"/>
@@ -14534,6 +14926,7 @@
               </w:rPr>
               <w:t>ATA_BIT</w:t>
             </w:r>
+            <w:proofErr w:type="spellEnd"/>
           </w:p>
         </w:tc>
         <w:tc>
@@ -14544,9 +14937,6 @@
           <w:p>
             <w:pPr>
               <w:jc w:val="left"/>
-              <w:rPr>
-                <w:rFonts w:hint="eastAsia"/>
-              </w:rPr>
             </w:pPr>
             <w:r>
               <w:rPr>
@@ -14575,9 +14965,6 @@
           <w:p>
             <w:pPr>
               <w:jc w:val="center"/>
-              <w:rPr>
-                <w:rFonts w:hint="eastAsia"/>
-              </w:rPr>
             </w:pPr>
             <w:r>
               <w:rPr>
@@ -14595,9 +14982,6 @@
           <w:p>
             <w:pPr>
               <w:jc w:val="center"/>
-              <w:rPr>
-                <w:rFonts w:hint="eastAsia"/>
-              </w:rPr>
             </w:pPr>
             <w:r>
               <w:t>input</w:t>
@@ -14612,10 +14996,8 @@
           <w:p>
             <w:pPr>
               <w:jc w:val="center"/>
-              <w:rPr>
-                <w:rFonts w:hint="eastAsia"/>
-              </w:rPr>
-            </w:pPr>
+            </w:pPr>
+            <w:proofErr w:type="spellStart"/>
             <w:r>
               <w:rPr>
                 <w:rFonts w:hint="eastAsia"/>
@@ -14625,6 +15007,7 @@
             <w:r>
               <w:t>_pc_addr</w:t>
             </w:r>
+            <w:proofErr w:type="spellEnd"/>
           </w:p>
         </w:tc>
         <w:tc>
@@ -14636,10 +15019,10 @@
             <w:pPr>
               <w:jc w:val="center"/>
               <w:rPr>
-                <w:rFonts w:hint="eastAsia"/>
-                <w:b/>
-              </w:rPr>
-            </w:pPr>
+                <w:b/>
+              </w:rPr>
+            </w:pPr>
+            <w:proofErr w:type="spellStart"/>
             <w:r>
               <w:rPr>
                 <w:rFonts w:hint="eastAsia"/>
@@ -14653,6 +15036,7 @@
               </w:rPr>
               <w:t>DDR_BIT</w:t>
             </w:r>
+            <w:proofErr w:type="spellEnd"/>
           </w:p>
         </w:tc>
         <w:tc>
@@ -14663,9 +15047,6 @@
           <w:p>
             <w:pPr>
               <w:jc w:val="left"/>
-              <w:rPr>
-                <w:rFonts w:hint="eastAsia"/>
-              </w:rPr>
             </w:pPr>
             <w:r>
               <w:rPr>
@@ -14694,9 +15075,6 @@
           <w:p>
             <w:pPr>
               <w:jc w:val="center"/>
-              <w:rPr>
-                <w:rFonts w:hint="eastAsia"/>
-              </w:rPr>
             </w:pPr>
             <w:r>
               <w:rPr>
@@ -14714,9 +15092,6 @@
           <w:p>
             <w:pPr>
               <w:jc w:val="center"/>
-              <w:rPr>
-                <w:rFonts w:hint="eastAsia"/>
-              </w:rPr>
             </w:pPr>
             <w:r>
               <w:rPr>
@@ -14737,10 +15112,8 @@
           <w:p>
             <w:pPr>
               <w:jc w:val="center"/>
-              <w:rPr>
-                <w:rFonts w:hint="eastAsia"/>
-              </w:rPr>
-            </w:pPr>
+            </w:pPr>
+            <w:proofErr w:type="spellStart"/>
             <w:r>
               <w:rPr>
                 <w:rFonts w:hint="eastAsia"/>
@@ -14750,6 +15123,7 @@
             <w:r>
               <w:t>_i_mem_data</w:t>
             </w:r>
+            <w:proofErr w:type="spellEnd"/>
           </w:p>
         </w:tc>
         <w:tc>
@@ -14761,10 +15135,10 @@
             <w:pPr>
               <w:jc w:val="center"/>
               <w:rPr>
-                <w:rFonts w:hint="eastAsia"/>
-                <w:b/>
-              </w:rPr>
-            </w:pPr>
+                <w:b/>
+              </w:rPr>
+            </w:pPr>
+            <w:proofErr w:type="spellStart"/>
             <w:r>
               <w:rPr>
                 <w:rFonts w:hint="eastAsia"/>
@@ -14778,6 +15152,7 @@
               </w:rPr>
               <w:t>ATA_BIT</w:t>
             </w:r>
+            <w:proofErr w:type="spellEnd"/>
           </w:p>
         </w:tc>
         <w:tc>
@@ -14788,9 +15163,6 @@
           <w:p>
             <w:pPr>
               <w:jc w:val="left"/>
-              <w:rPr>
-                <w:rFonts w:hint="eastAsia"/>
-              </w:rPr>
             </w:pPr>
             <w:r>
               <w:rPr>
@@ -14819,9 +15191,6 @@
           <w:p>
             <w:pPr>
               <w:jc w:val="center"/>
-              <w:rPr>
-                <w:rFonts w:hint="eastAsia"/>
-              </w:rPr>
             </w:pPr>
             <w:r>
               <w:rPr>
@@ -14839,9 +15208,6 @@
           <w:p>
             <w:pPr>
               <w:jc w:val="center"/>
-              <w:rPr>
-                <w:rFonts w:hint="eastAsia"/>
-              </w:rPr>
             </w:pPr>
             <w:r>
               <w:rPr>
@@ -14862,10 +15228,8 @@
           <w:p>
             <w:pPr>
               <w:jc w:val="center"/>
-              <w:rPr>
-                <w:rFonts w:hint="eastAsia"/>
-              </w:rPr>
-            </w:pPr>
+            </w:pPr>
+            <w:proofErr w:type="spellStart"/>
             <w:r>
               <w:rPr>
                 <w:rFonts w:hint="eastAsia"/>
@@ -14875,6 +15239,7 @@
             <w:r>
               <w:t>_pc_addr</w:t>
             </w:r>
+            <w:proofErr w:type="spellEnd"/>
           </w:p>
         </w:tc>
         <w:tc>
@@ -14886,10 +15251,10 @@
             <w:pPr>
               <w:jc w:val="center"/>
               <w:rPr>
-                <w:rFonts w:hint="eastAsia"/>
-                <w:b/>
-              </w:rPr>
-            </w:pPr>
+                <w:b/>
+              </w:rPr>
+            </w:pPr>
+            <w:proofErr w:type="spellStart"/>
             <w:r>
               <w:rPr>
                 <w:rFonts w:hint="eastAsia"/>
@@ -14903,6 +15268,7 @@
               </w:rPr>
               <w:t>DDR_BIT</w:t>
             </w:r>
+            <w:proofErr w:type="spellEnd"/>
           </w:p>
         </w:tc>
         <w:tc>
@@ -14913,9 +15279,6 @@
           <w:p>
             <w:pPr>
               <w:jc w:val="left"/>
-              <w:rPr>
-                <w:rFonts w:hint="eastAsia"/>
-              </w:rPr>
             </w:pPr>
             <w:r>
               <w:rPr>
@@ -14936,13 +15299,7 @@
         </w:tc>
       </w:tr>
     </w:tbl>
-    <w:p>
-      <w:pPr>
-        <w:rPr>
-          <w:rFonts w:hint="eastAsia"/>
-        </w:rPr>
-      </w:pPr>
-    </w:p>
+    <w:p/>
     <w:p>
       <w:pPr>
         <w:pStyle w:val="4"/>
@@ -14984,11 +15341,27 @@
               <w:rPr>
                 <w:rFonts w:hint="eastAsia"/>
               </w:rPr>
-              <w:t xml:space="preserve">1. 모든 출력값은 </w:t>
-            </w:r>
+              <w:t xml:space="preserve">1. 모든 </w:t>
+            </w:r>
+            <w:proofErr w:type="spellStart"/>
+            <w:r>
+              <w:rPr>
+                <w:rFonts w:hint="eastAsia"/>
+              </w:rPr>
+              <w:t>출력값은</w:t>
+            </w:r>
+            <w:proofErr w:type="spellEnd"/>
+            <w:r>
+              <w:rPr>
+                <w:rFonts w:hint="eastAsia"/>
+              </w:rPr>
+              <w:t xml:space="preserve"> </w:t>
+            </w:r>
+            <w:proofErr w:type="spellStart"/>
             <w:r>
               <w:t>rst_n</w:t>
             </w:r>
+            <w:proofErr w:type="spellEnd"/>
             <w:r>
               <w:rPr>
                 <w:rFonts w:hint="eastAsia"/>
@@ -15024,24 +15397,36 @@
             <w:r>
               <w:t xml:space="preserve">.1 </w:t>
             </w:r>
-            <w:r>
-              <w:rPr>
-                <w:rFonts w:hint="eastAsia"/>
-              </w:rPr>
-              <w:t xml:space="preserve">출력값 </w:t>
-            </w:r>
+            <w:proofErr w:type="spellStart"/>
+            <w:r>
+              <w:rPr>
+                <w:rFonts w:hint="eastAsia"/>
+              </w:rPr>
+              <w:t>출력값</w:t>
+            </w:r>
+            <w:proofErr w:type="spellEnd"/>
+            <w:r>
+              <w:rPr>
+                <w:rFonts w:hint="eastAsia"/>
+              </w:rPr>
+              <w:t xml:space="preserve"> </w:t>
+            </w:r>
+            <w:proofErr w:type="spellStart"/>
             <w:r>
               <w:t>o_pc_addr</w:t>
             </w:r>
+            <w:proofErr w:type="spellEnd"/>
             <w:r>
               <w:rPr>
                 <w:rFonts w:hint="eastAsia"/>
               </w:rPr>
               <w:t xml:space="preserve">은 </w:t>
             </w:r>
+            <w:proofErr w:type="spellStart"/>
             <w:r>
               <w:t>rst_n</w:t>
             </w:r>
+            <w:proofErr w:type="spellEnd"/>
             <w:r>
               <w:rPr>
                 <w:rFonts w:hint="eastAsia"/>
@@ -15069,6 +15454,7 @@
             <w:r>
               <w:t>‘</w:t>
             </w:r>
+            <w:proofErr w:type="spellStart"/>
             <w:r>
               <w:rPr>
                 <w:rFonts w:hint="eastAsia"/>
@@ -15078,6 +15464,7 @@
             <w:r>
               <w:t>0</w:t>
             </w:r>
+            <w:proofErr w:type="spellEnd"/>
             <w:r>
               <w:rPr>
                 <w:rFonts w:hint="eastAsia"/>
@@ -15091,10 +15478,29 @@
               <w:rPr>
                 <w:rFonts w:hint="eastAsia"/>
               </w:rPr>
-              <w:t xml:space="preserve">이후에는 입력값 </w:t>
-            </w:r>
-            <w:r>
-              <w:t xml:space="preserve">i_pc_addr </w:t>
+              <w:t xml:space="preserve">이후에는 </w:t>
+            </w:r>
+            <w:proofErr w:type="spellStart"/>
+            <w:r>
+              <w:rPr>
+                <w:rFonts w:hint="eastAsia"/>
+              </w:rPr>
+              <w:t>입력값</w:t>
+            </w:r>
+            <w:proofErr w:type="spellEnd"/>
+            <w:r>
+              <w:rPr>
+                <w:rFonts w:hint="eastAsia"/>
+              </w:rPr>
+              <w:t xml:space="preserve"> </w:t>
+            </w:r>
+            <w:proofErr w:type="spellStart"/>
+            <w:r>
+              <w:t>i_pc_addr</w:t>
+            </w:r>
+            <w:proofErr w:type="spellEnd"/>
+            <w:r>
+              <w:t xml:space="preserve"> </w:t>
             </w:r>
             <w:r>
               <w:rPr>
@@ -15119,24 +15525,36 @@
             <w:r>
               <w:t xml:space="preserve"> </w:t>
             </w:r>
-            <w:r>
-              <w:rPr>
-                <w:rFonts w:hint="eastAsia"/>
-              </w:rPr>
-              <w:t xml:space="preserve">출력값 </w:t>
-            </w:r>
+            <w:proofErr w:type="spellStart"/>
+            <w:r>
+              <w:rPr>
+                <w:rFonts w:hint="eastAsia"/>
+              </w:rPr>
+              <w:t>출력값</w:t>
+            </w:r>
+            <w:proofErr w:type="spellEnd"/>
+            <w:r>
+              <w:rPr>
+                <w:rFonts w:hint="eastAsia"/>
+              </w:rPr>
+              <w:t xml:space="preserve"> </w:t>
+            </w:r>
+            <w:proofErr w:type="spellStart"/>
             <w:r>
               <w:t>o_i_mem_data</w:t>
             </w:r>
+            <w:proofErr w:type="spellEnd"/>
             <w:r>
               <w:rPr>
                 <w:rFonts w:hint="eastAsia"/>
               </w:rPr>
               <w:t xml:space="preserve">는 </w:t>
             </w:r>
+            <w:proofErr w:type="spellStart"/>
             <w:r>
               <w:t>rst_n</w:t>
             </w:r>
+            <w:proofErr w:type="spellEnd"/>
             <w:r>
               <w:rPr>
                 <w:rFonts w:hint="eastAsia"/>
@@ -15162,8 +15580,13 @@
               <w:t xml:space="preserve">이 지나기 전까지 </w:t>
             </w:r>
             <w:r>
-              <w:t>‘d0</w:t>
-            </w:r>
+              <w:t>‘</w:t>
+            </w:r>
+            <w:proofErr w:type="spellStart"/>
+            <w:r>
+              <w:t>d0</w:t>
+            </w:r>
+            <w:proofErr w:type="spellEnd"/>
             <w:r>
               <w:rPr>
                 <w:rFonts w:hint="eastAsia"/>
@@ -15187,21 +15610,32 @@
             <w:r>
               <w:t xml:space="preserve"> </w:t>
             </w:r>
-            <w:r>
-              <w:rPr>
-                <w:rFonts w:hint="eastAsia"/>
-              </w:rPr>
-              <w:t xml:space="preserve">입력값 </w:t>
-            </w:r>
+            <w:proofErr w:type="spellStart"/>
+            <w:r>
+              <w:rPr>
+                <w:rFonts w:hint="eastAsia"/>
+              </w:rPr>
+              <w:t>입력값</w:t>
+            </w:r>
+            <w:proofErr w:type="spellEnd"/>
+            <w:r>
+              <w:rPr>
+                <w:rFonts w:hint="eastAsia"/>
+              </w:rPr>
+              <w:t xml:space="preserve"> </w:t>
+            </w:r>
+            <w:proofErr w:type="spellStart"/>
             <w:r>
               <w:t>i_flush</w:t>
             </w:r>
+            <w:proofErr w:type="spellEnd"/>
             <w:r>
               <w:rPr>
                 <w:rFonts w:hint="eastAsia"/>
               </w:rPr>
               <w:t xml:space="preserve"> 신호가 </w:t>
             </w:r>
+            <w:proofErr w:type="spellStart"/>
             <w:r>
               <w:t>1’</w:t>
             </w:r>
@@ -15214,6 +15648,7 @@
             <w:r>
               <w:t>1</w:t>
             </w:r>
+            <w:proofErr w:type="spellEnd"/>
             <w:r>
               <w:rPr>
                 <w:rFonts w:hint="eastAsia"/>
@@ -15223,15 +15658,25 @@
             <w:r>
               <w:t xml:space="preserve"> </w:t>
             </w:r>
-            <w:r>
-              <w:rPr>
-                <w:rFonts w:hint="eastAsia"/>
-              </w:rPr>
-              <w:t xml:space="preserve">출력값 </w:t>
-            </w:r>
+            <w:proofErr w:type="spellStart"/>
+            <w:r>
+              <w:rPr>
+                <w:rFonts w:hint="eastAsia"/>
+              </w:rPr>
+              <w:t>출력값</w:t>
+            </w:r>
+            <w:proofErr w:type="spellEnd"/>
+            <w:r>
+              <w:rPr>
+                <w:rFonts w:hint="eastAsia"/>
+              </w:rPr>
+              <w:t xml:space="preserve"> </w:t>
+            </w:r>
+            <w:proofErr w:type="spellStart"/>
             <w:r>
               <w:t>o_i_mem_data</w:t>
             </w:r>
+            <w:proofErr w:type="spellEnd"/>
             <w:r>
               <w:rPr>
                 <w:rFonts w:hint="eastAsia"/>
@@ -15250,6 +15695,7 @@
             <w:r>
               <w:t>‘</w:t>
             </w:r>
+            <w:proofErr w:type="spellStart"/>
             <w:r>
               <w:rPr>
                 <w:rFonts w:hint="eastAsia"/>
@@ -15259,6 +15705,7 @@
             <w:r>
               <w:t>0</w:t>
             </w:r>
+            <w:proofErr w:type="spellEnd"/>
             <w:r>
               <w:rPr>
                 <w:rFonts w:hint="eastAsia"/>
@@ -15267,11 +15714,6 @@
             </w:r>
           </w:p>
           <w:p>
-            <w:pPr>
-              <w:rPr>
-                <w:rFonts w:hint="eastAsia"/>
-              </w:rPr>
-            </w:pPr>
             <w:r>
               <w:rPr>
                 <w:rFonts w:hint="eastAsia"/>
@@ -15281,14 +15723,27 @@
             <w:r>
               <w:t xml:space="preserve">.2.3 </w:t>
             </w:r>
-            <w:r>
-              <w:rPr>
-                <w:rFonts w:hint="eastAsia"/>
-              </w:rPr>
-              <w:t xml:space="preserve">입력값 </w:t>
-            </w:r>
-            <w:r>
-              <w:t xml:space="preserve">i_stall </w:t>
+            <w:proofErr w:type="spellStart"/>
+            <w:r>
+              <w:rPr>
+                <w:rFonts w:hint="eastAsia"/>
+              </w:rPr>
+              <w:t>입력값</w:t>
+            </w:r>
+            <w:proofErr w:type="spellEnd"/>
+            <w:r>
+              <w:rPr>
+                <w:rFonts w:hint="eastAsia"/>
+              </w:rPr>
+              <w:t xml:space="preserve"> </w:t>
+            </w:r>
+            <w:proofErr w:type="spellStart"/>
+            <w:r>
+              <w:t>i_stall</w:t>
+            </w:r>
+            <w:proofErr w:type="spellEnd"/>
+            <w:r>
+              <w:t xml:space="preserve"> </w:t>
             </w:r>
             <w:r>
               <w:rPr>
@@ -15296,9 +15751,11 @@
               </w:rPr>
               <w:t xml:space="preserve">신호가 </w:t>
             </w:r>
+            <w:proofErr w:type="spellStart"/>
             <w:r>
               <w:t>1’b1</w:t>
             </w:r>
+            <w:proofErr w:type="spellEnd"/>
             <w:r>
               <w:rPr>
                 <w:rFonts w:hint="eastAsia"/>
@@ -15308,15 +15765,25 @@
             <w:r>
               <w:t xml:space="preserve"> </w:t>
             </w:r>
-            <w:r>
-              <w:rPr>
-                <w:rFonts w:hint="eastAsia"/>
-              </w:rPr>
-              <w:t xml:space="preserve">출력값 </w:t>
-            </w:r>
+            <w:proofErr w:type="spellStart"/>
+            <w:r>
+              <w:rPr>
+                <w:rFonts w:hint="eastAsia"/>
+              </w:rPr>
+              <w:t>출력값</w:t>
+            </w:r>
+            <w:proofErr w:type="spellEnd"/>
+            <w:r>
+              <w:rPr>
+                <w:rFonts w:hint="eastAsia"/>
+              </w:rPr>
+              <w:t xml:space="preserve"> </w:t>
+            </w:r>
+            <w:proofErr w:type="spellStart"/>
             <w:r>
               <w:t>o_i_memdata</w:t>
             </w:r>
+            <w:proofErr w:type="spellEnd"/>
             <w:r>
               <w:rPr>
                 <w:rFonts w:hint="eastAsia"/>
@@ -15327,13 +15794,7 @@
         </w:tc>
       </w:tr>
     </w:tbl>
-    <w:p>
-      <w:pPr>
-        <w:rPr>
-          <w:rFonts w:hint="eastAsia"/>
-        </w:rPr>
-      </w:pPr>
-    </w:p>
+    <w:p/>
     <w:p>
       <w:pPr>
         <w:pStyle w:val="3"/>
@@ -15422,13 +15883,7 @@
       </w:r>
       <w:bookmarkEnd w:id="83"/>
     </w:p>
-    <w:p>
-      <w:pPr>
-        <w:rPr>
-          <w:rFonts w:hint="eastAsia"/>
-        </w:rPr>
-      </w:pPr>
-    </w:p>
+    <w:p/>
     <w:p>
       <w:pPr>
         <w:pStyle w:val="3"/>
@@ -15499,13 +15954,7 @@
       </w:r>
       <w:bookmarkEnd w:id="87"/>
     </w:p>
-    <w:p>
-      <w:pPr>
-        <w:rPr>
-          <w:rFonts w:hint="eastAsia"/>
-        </w:rPr>
-      </w:pPr>
-    </w:p>
+    <w:p/>
     <w:p>
       <w:pPr>
         <w:pStyle w:val="3"/>
@@ -15577,13 +16026,7 @@
       </w:r>
       <w:bookmarkEnd w:id="91"/>
     </w:p>
-    <w:p>
-      <w:pPr>
-        <w:rPr>
-          <w:rFonts w:hint="eastAsia"/>
-        </w:rPr>
-      </w:pPr>
-    </w:p>
+    <w:p/>
     <w:p>
       <w:pPr>
         <w:pStyle w:val="2"/>
@@ -15646,8 +16089,16 @@
         <w:rPr>
           <w:rFonts w:hint="eastAsia"/>
         </w:rPr>
-        <w:t>명령어 복호기</w:t>
-      </w:r>
+        <w:t xml:space="preserve">명령어 </w:t>
+      </w:r>
+      <w:proofErr w:type="spellStart"/>
+      <w:r>
+        <w:rPr>
+          <w:rFonts w:hint="eastAsia"/>
+        </w:rPr>
+        <w:t>복호기</w:t>
+      </w:r>
+      <w:proofErr w:type="spellEnd"/>
       <w:r>
         <w:t>(Instruction Decoder)</w:t>
       </w:r>
@@ -15666,11 +16117,19 @@
       <w:bookmarkStart w:id="106" w:name="_Ref229928652"/>
       <w:bookmarkStart w:id="107" w:name="_Toc230456459"/>
       <w:bookmarkStart w:id="108" w:name="_Toc230458259"/>
+      <w:proofErr w:type="spellStart"/>
       <w:r>
         <w:rPr>
           <w:rFonts w:hint="eastAsia"/>
         </w:rPr>
-        <w:t>승제산 장치(</w:t>
+        <w:t>승제산</w:t>
+      </w:r>
+      <w:proofErr w:type="spellEnd"/>
+      <w:r>
+        <w:rPr>
+          <w:rFonts w:hint="eastAsia"/>
+        </w:rPr>
+        <w:t xml:space="preserve"> 장치(</w:t>
       </w:r>
       <w:r>
         <w:t>Mul/Div Unit)</w:t>
@@ -15690,12 +16149,14 @@
       <w:bookmarkStart w:id="111" w:name="_Ref229928656"/>
       <w:bookmarkStart w:id="112" w:name="_Toc230456460"/>
       <w:bookmarkStart w:id="113" w:name="_Toc230458260"/>
+      <w:proofErr w:type="spellStart"/>
       <w:r>
         <w:rPr>
           <w:rFonts w:hint="eastAsia"/>
         </w:rPr>
         <w:t>멀티플렉서</w:t>
       </w:r>
+      <w:proofErr w:type="spellEnd"/>
       <w:r>
         <w:t>(Multiplexer)</w:t>
       </w:r>
@@ -15764,7 +16225,21 @@
         <w:rPr>
           <w:rFonts w:hint="eastAsia"/>
         </w:rPr>
-        <w:t>좌측 쉬프트 이동기</w:t>
+        <w:t xml:space="preserve">좌측 </w:t>
+      </w:r>
+      <w:proofErr w:type="spellStart"/>
+      <w:r>
+        <w:rPr>
+          <w:rFonts w:hint="eastAsia"/>
+        </w:rPr>
+        <w:t>쉬프트</w:t>
+      </w:r>
+      <w:proofErr w:type="spellEnd"/>
+      <w:r>
+        <w:rPr>
+          <w:rFonts w:hint="eastAsia"/>
+        </w:rPr>
+        <w:t xml:space="preserve"> 이동기</w:t>
       </w:r>
       <w:r>
         <w:t>(Shift Left Unit)</w:t>
@@ -15787,7 +16262,21 @@
         <w:rPr>
           <w:rFonts w:hint="eastAsia"/>
         </w:rPr>
-        <w:t>부호 확장기(</w:t>
+        <w:t xml:space="preserve">부호 </w:t>
+      </w:r>
+      <w:proofErr w:type="spellStart"/>
+      <w:r>
+        <w:rPr>
+          <w:rFonts w:hint="eastAsia"/>
+        </w:rPr>
+        <w:t>확장기</w:t>
+      </w:r>
+      <w:proofErr w:type="spellEnd"/>
+      <w:r>
+        <w:rPr>
+          <w:rFonts w:hint="eastAsia"/>
+        </w:rPr>
+        <w:t>(</w:t>
       </w:r>
       <w:r>
         <w:t>Sign Extend Unit)</w:t>
@@ -17718,6 +18207,7 @@
   <w:style w:type="character" w:default="1" w:styleId="a0">
     <w:name w:val="Default Paragraph Font"/>
     <w:uiPriority w:val="1"/>
+    <w:semiHidden/>
     <w:unhideWhenUsed/>
   </w:style>
   <w:style w:type="table" w:default="1" w:styleId="a1">

</xml_diff>